<commit_message>
replace old version of lab6 worksheet
</commit_message>
<xml_diff>
--- a/Day6/Lab6_LLM_Worksheet.docx
+++ b/Day6/Lab6_LLM_Worksheet.docx
@@ -1940,6 +1940,795 @@
         <w:spacing w:before="300" w:after="100"/>
       </w:pPr>
       <w:r>
+        <w:t>Raspberry Pi 5 — Model 3: deepseek-r1:7b</w:t>
+      </w:r>
+    </w:p>
+    <w:tbl>
+      <w:tblPr>
+        <w:tblW w:w="9360" w:type="dxa"/>
+        <w:tblBorders>
+          <w:top w:val="single" w:sz="4" w:space="0" w:color="auto"/>
+          <w:left w:val="single" w:sz="4" w:space="0" w:color="auto"/>
+          <w:bottom w:val="single" w:sz="4" w:space="0" w:color="auto"/>
+          <w:right w:val="single" w:sz="4" w:space="0" w:color="auto"/>
+          <w:insideH w:val="single" w:sz="4" w:space="0" w:color="auto"/>
+          <w:insideV w:val="single" w:sz="4" w:space="0" w:color="auto"/>
+        </w:tblBorders>
+        <w:tblCellMar>
+          <w:left w:w="10" w:type="dxa"/>
+          <w:right w:w="10" w:type="dxa"/>
+        </w:tblCellMar>
+        <w:tblLook w:val="04A0" w:firstRow="1" w:lastRow="0" w:firstColumn="1" w:lastColumn="0" w:noHBand="0" w:noVBand="1"/>
+      </w:tblPr>
+      <w:tblGrid>
+        <w:gridCol w:w="3200"/>
+        <w:gridCol w:w="2000"/>
+        <w:gridCol w:w="4160"/>
+      </w:tblGrid>
+      <w:tr>
+        <w:tblPrEx>
+          <w:tblCellMar>
+            <w:top w:w="0" w:type="dxa"/>
+            <w:bottom w:w="0" w:type="dxa"/>
+          </w:tblCellMar>
+        </w:tblPrEx>
+        <w:tc>
+          <w:tcPr>
+            <w:tcW w:w="3200" w:type="dxa"/>
+            <w:tcBorders>
+              <w:top w:val="single" w:sz="1" w:space="0" w:color="000000"/>
+              <w:left w:val="single" w:sz="1" w:space="0" w:color="000000"/>
+              <w:bottom w:val="single" w:sz="1" w:space="0" w:color="000000"/>
+              <w:right w:val="single" w:sz="1" w:space="0" w:color="000000"/>
+            </w:tcBorders>
+            <w:shd w:val="clear" w:color="auto" w:fill="D5E8F0"/>
+            <w:tcMar>
+              <w:top w:w="80" w:type="dxa"/>
+              <w:left w:w="120" w:type="dxa"/>
+              <w:bottom w:w="80" w:type="dxa"/>
+              <w:right w:w="120" w:type="dxa"/>
+            </w:tcMar>
+          </w:tcPr>
+          <w:p>
+            <w:r>
+              <w:rPr>
+                <w:b/>
+                <w:bCs/>
+                <w:sz w:val="20"/>
+                <w:szCs w:val="20"/>
+              </w:rPr>
+              <w:t>Metric</w:t>
+            </w:r>
+          </w:p>
+        </w:tc>
+        <w:tc>
+          <w:tcPr>
+            <w:tcW w:w="2000" w:type="dxa"/>
+            <w:tcBorders>
+              <w:top w:val="single" w:sz="1" w:space="0" w:color="000000"/>
+              <w:left w:val="single" w:sz="1" w:space="0" w:color="000000"/>
+              <w:bottom w:val="single" w:sz="1" w:space="0" w:color="000000"/>
+              <w:right w:val="single" w:sz="1" w:space="0" w:color="000000"/>
+            </w:tcBorders>
+            <w:shd w:val="clear" w:color="auto" w:fill="D5E8F0"/>
+            <w:tcMar>
+              <w:top w:w="80" w:type="dxa"/>
+              <w:left w:w="120" w:type="dxa"/>
+              <w:bottom w:w="80" w:type="dxa"/>
+              <w:right w:w="120" w:type="dxa"/>
+            </w:tcMar>
+          </w:tcPr>
+          <w:p>
+            <w:r>
+              <w:rPr>
+                <w:b/>
+                <w:bCs/>
+                <w:sz w:val="20"/>
+                <w:szCs w:val="20"/>
+              </w:rPr>
+              <w:t>Value</w:t>
+            </w:r>
+          </w:p>
+        </w:tc>
+        <w:tc>
+          <w:tcPr>
+            <w:tcW w:w="4160" w:type="dxa"/>
+            <w:tcBorders>
+              <w:top w:val="single" w:sz="1" w:space="0" w:color="000000"/>
+              <w:left w:val="single" w:sz="1" w:space="0" w:color="000000"/>
+              <w:bottom w:val="single" w:sz="1" w:space="0" w:color="000000"/>
+              <w:right w:val="single" w:sz="1" w:space="0" w:color="000000"/>
+            </w:tcBorders>
+            <w:shd w:val="clear" w:color="auto" w:fill="D5E8F0"/>
+            <w:tcMar>
+              <w:top w:w="80" w:type="dxa"/>
+              <w:left w:w="120" w:type="dxa"/>
+              <w:bottom w:w="80" w:type="dxa"/>
+              <w:right w:w="120" w:type="dxa"/>
+            </w:tcMar>
+          </w:tcPr>
+          <w:p>
+            <w:r>
+              <w:rPr>
+                <w:b/>
+                <w:bCs/>
+                <w:sz w:val="20"/>
+                <w:szCs w:val="20"/>
+              </w:rPr>
+              <w:t>Description</w:t>
+            </w:r>
+          </w:p>
+        </w:tc>
+      </w:tr>
+      <w:tr>
+        <w:tblPrEx>
+          <w:tblCellMar>
+            <w:top w:w="0" w:type="dxa"/>
+            <w:bottom w:w="0" w:type="dxa"/>
+          </w:tblCellMar>
+        </w:tblPrEx>
+        <w:tc>
+          <w:tcPr>
+            <w:tcW w:w="3200" w:type="dxa"/>
+            <w:tcBorders>
+              <w:top w:val="single" w:sz="1" w:space="0" w:color="000000"/>
+              <w:left w:val="single" w:sz="1" w:space="0" w:color="000000"/>
+              <w:bottom w:val="single" w:sz="1" w:space="0" w:color="000000"/>
+              <w:right w:val="single" w:sz="1" w:space="0" w:color="000000"/>
+            </w:tcBorders>
+            <w:tcMar>
+              <w:top w:w="80" w:type="dxa"/>
+              <w:left w:w="120" w:type="dxa"/>
+              <w:bottom w:w="80" w:type="dxa"/>
+              <w:right w:w="120" w:type="dxa"/>
+            </w:tcMar>
+          </w:tcPr>
+          <w:p>
+            <w:r>
+              <w:rPr>
+                <w:sz w:val="20"/>
+                <w:szCs w:val="20"/>
+              </w:rPr>
+              <w:t>Total Duration</w:t>
+            </w:r>
+          </w:p>
+        </w:tc>
+        <w:tc>
+          <w:tcPr>
+            <w:tcW w:w="2000" w:type="dxa"/>
+            <w:tcBorders>
+              <w:top w:val="single" w:sz="1" w:space="0" w:color="000000"/>
+              <w:left w:val="single" w:sz="1" w:space="0" w:color="000000"/>
+              <w:bottom w:val="single" w:sz="1" w:space="0" w:color="000000"/>
+              <w:right w:val="single" w:sz="1" w:space="0" w:color="000000"/>
+            </w:tcBorders>
+            <w:tcMar>
+              <w:top w:w="80" w:type="dxa"/>
+              <w:left w:w="120" w:type="dxa"/>
+              <w:bottom w:w="80" w:type="dxa"/>
+              <w:right w:w="120" w:type="dxa"/>
+            </w:tcMar>
+          </w:tcPr>
+          <w:p>
+            <w:pPr>
+              <w:spacing w:after="200"/>
+            </w:pPr>
+          </w:p>
+        </w:tc>
+        <w:tc>
+          <w:tcPr>
+            <w:tcW w:w="4160" w:type="dxa"/>
+            <w:tcBorders>
+              <w:top w:val="single" w:sz="1" w:space="0" w:color="000000"/>
+              <w:left w:val="single" w:sz="1" w:space="0" w:color="000000"/>
+              <w:bottom w:val="single" w:sz="1" w:space="0" w:color="000000"/>
+              <w:right w:val="single" w:sz="1" w:space="0" w:color="000000"/>
+            </w:tcBorders>
+            <w:tcMar>
+              <w:top w:w="80" w:type="dxa"/>
+              <w:left w:w="120" w:type="dxa"/>
+              <w:bottom w:w="80" w:type="dxa"/>
+              <w:right w:w="120" w:type="dxa"/>
+            </w:tcMar>
+          </w:tcPr>
+          <w:p>
+            <w:r>
+              <w:rPr>
+                <w:sz w:val="20"/>
+                <w:szCs w:val="20"/>
+              </w:rPr>
+              <w:t>Full execution time</w:t>
+            </w:r>
+          </w:p>
+        </w:tc>
+      </w:tr>
+      <w:tr>
+        <w:tblPrEx>
+          <w:tblCellMar>
+            <w:top w:w="0" w:type="dxa"/>
+            <w:bottom w:w="0" w:type="dxa"/>
+          </w:tblCellMar>
+        </w:tblPrEx>
+        <w:tc>
+          <w:tcPr>
+            <w:tcW w:w="3200" w:type="dxa"/>
+            <w:tcBorders>
+              <w:top w:val="single" w:sz="1" w:space="0" w:color="000000"/>
+              <w:left w:val="single" w:sz="1" w:space="0" w:color="000000"/>
+              <w:bottom w:val="single" w:sz="1" w:space="0" w:color="000000"/>
+              <w:right w:val="single" w:sz="1" w:space="0" w:color="000000"/>
+            </w:tcBorders>
+            <w:tcMar>
+              <w:top w:w="80" w:type="dxa"/>
+              <w:left w:w="120" w:type="dxa"/>
+              <w:bottom w:w="80" w:type="dxa"/>
+              <w:right w:w="120" w:type="dxa"/>
+            </w:tcMar>
+          </w:tcPr>
+          <w:p>
+            <w:r>
+              <w:rPr>
+                <w:sz w:val="20"/>
+                <w:szCs w:val="20"/>
+              </w:rPr>
+              <w:t>Load Duration</w:t>
+            </w:r>
+          </w:p>
+        </w:tc>
+        <w:tc>
+          <w:tcPr>
+            <w:tcW w:w="2000" w:type="dxa"/>
+            <w:tcBorders>
+              <w:top w:val="single" w:sz="1" w:space="0" w:color="000000"/>
+              <w:left w:val="single" w:sz="1" w:space="0" w:color="000000"/>
+              <w:bottom w:val="single" w:sz="1" w:space="0" w:color="000000"/>
+              <w:right w:val="single" w:sz="1" w:space="0" w:color="000000"/>
+            </w:tcBorders>
+            <w:tcMar>
+              <w:top w:w="80" w:type="dxa"/>
+              <w:left w:w="120" w:type="dxa"/>
+              <w:bottom w:w="80" w:type="dxa"/>
+              <w:right w:w="120" w:type="dxa"/>
+            </w:tcMar>
+          </w:tcPr>
+          <w:p>
+            <w:pPr>
+              <w:spacing w:after="200"/>
+            </w:pPr>
+          </w:p>
+        </w:tc>
+        <w:tc>
+          <w:tcPr>
+            <w:tcW w:w="4160" w:type="dxa"/>
+            <w:tcBorders>
+              <w:top w:val="single" w:sz="1" w:space="0" w:color="000000"/>
+              <w:left w:val="single" w:sz="1" w:space="0" w:color="000000"/>
+              <w:bottom w:val="single" w:sz="1" w:space="0" w:color="000000"/>
+              <w:right w:val="single" w:sz="1" w:space="0" w:color="000000"/>
+            </w:tcBorders>
+            <w:tcMar>
+              <w:top w:w="80" w:type="dxa"/>
+              <w:left w:w="120" w:type="dxa"/>
+              <w:bottom w:w="80" w:type="dxa"/>
+              <w:right w:w="120" w:type="dxa"/>
+            </w:tcMar>
+          </w:tcPr>
+          <w:p>
+            <w:r>
+              <w:rPr>
+                <w:sz w:val="20"/>
+                <w:szCs w:val="20"/>
+              </w:rPr>
+              <w:t>Model loading time</w:t>
+            </w:r>
+          </w:p>
+        </w:tc>
+      </w:tr>
+      <w:tr>
+        <w:tblPrEx>
+          <w:tblCellMar>
+            <w:top w:w="0" w:type="dxa"/>
+            <w:bottom w:w="0" w:type="dxa"/>
+          </w:tblCellMar>
+        </w:tblPrEx>
+        <w:tc>
+          <w:tcPr>
+            <w:tcW w:w="3200" w:type="dxa"/>
+            <w:tcBorders>
+              <w:top w:val="single" w:sz="1" w:space="0" w:color="000000"/>
+              <w:left w:val="single" w:sz="1" w:space="0" w:color="000000"/>
+              <w:bottom w:val="single" w:sz="1" w:space="0" w:color="000000"/>
+              <w:right w:val="single" w:sz="1" w:space="0" w:color="000000"/>
+            </w:tcBorders>
+            <w:tcMar>
+              <w:top w:w="80" w:type="dxa"/>
+              <w:left w:w="120" w:type="dxa"/>
+              <w:bottom w:w="80" w:type="dxa"/>
+              <w:right w:w="120" w:type="dxa"/>
+            </w:tcMar>
+          </w:tcPr>
+          <w:p>
+            <w:r>
+              <w:rPr>
+                <w:sz w:val="20"/>
+                <w:szCs w:val="20"/>
+              </w:rPr>
+              <w:t>Prompt Eval Count</w:t>
+            </w:r>
+          </w:p>
+        </w:tc>
+        <w:tc>
+          <w:tcPr>
+            <w:tcW w:w="2000" w:type="dxa"/>
+            <w:tcBorders>
+              <w:top w:val="single" w:sz="1" w:space="0" w:color="000000"/>
+              <w:left w:val="single" w:sz="1" w:space="0" w:color="000000"/>
+              <w:bottom w:val="single" w:sz="1" w:space="0" w:color="000000"/>
+              <w:right w:val="single" w:sz="1" w:space="0" w:color="000000"/>
+            </w:tcBorders>
+            <w:tcMar>
+              <w:top w:w="80" w:type="dxa"/>
+              <w:left w:w="120" w:type="dxa"/>
+              <w:bottom w:w="80" w:type="dxa"/>
+              <w:right w:w="120" w:type="dxa"/>
+            </w:tcMar>
+          </w:tcPr>
+          <w:p>
+            <w:pPr>
+              <w:spacing w:after="200"/>
+            </w:pPr>
+          </w:p>
+        </w:tc>
+        <w:tc>
+          <w:tcPr>
+            <w:tcW w:w="4160" w:type="dxa"/>
+            <w:tcBorders>
+              <w:top w:val="single" w:sz="1" w:space="0" w:color="000000"/>
+              <w:left w:val="single" w:sz="1" w:space="0" w:color="000000"/>
+              <w:bottom w:val="single" w:sz="1" w:space="0" w:color="000000"/>
+              <w:right w:val="single" w:sz="1" w:space="0" w:color="000000"/>
+            </w:tcBorders>
+            <w:tcMar>
+              <w:top w:w="80" w:type="dxa"/>
+              <w:left w:w="120" w:type="dxa"/>
+              <w:bottom w:w="80" w:type="dxa"/>
+              <w:right w:w="120" w:type="dxa"/>
+            </w:tcMar>
+          </w:tcPr>
+          <w:p>
+            <w:r>
+              <w:rPr>
+                <w:sz w:val="20"/>
+                <w:szCs w:val="20"/>
+              </w:rPr>
+              <w:t>Number of input tokens</w:t>
+            </w:r>
+          </w:p>
+        </w:tc>
+      </w:tr>
+      <w:tr>
+        <w:tblPrEx>
+          <w:tblCellMar>
+            <w:top w:w="0" w:type="dxa"/>
+            <w:bottom w:w="0" w:type="dxa"/>
+          </w:tblCellMar>
+        </w:tblPrEx>
+        <w:tc>
+          <w:tcPr>
+            <w:tcW w:w="3200" w:type="dxa"/>
+            <w:tcBorders>
+              <w:top w:val="single" w:sz="1" w:space="0" w:color="000000"/>
+              <w:left w:val="single" w:sz="1" w:space="0" w:color="000000"/>
+              <w:bottom w:val="single" w:sz="1" w:space="0" w:color="000000"/>
+              <w:right w:val="single" w:sz="1" w:space="0" w:color="000000"/>
+            </w:tcBorders>
+            <w:tcMar>
+              <w:top w:w="80" w:type="dxa"/>
+              <w:left w:w="120" w:type="dxa"/>
+              <w:bottom w:w="80" w:type="dxa"/>
+              <w:right w:w="120" w:type="dxa"/>
+            </w:tcMar>
+          </w:tcPr>
+          <w:p>
+            <w:r>
+              <w:rPr>
+                <w:sz w:val="20"/>
+                <w:szCs w:val="20"/>
+              </w:rPr>
+              <w:t>Prompt Eval Duration</w:t>
+            </w:r>
+          </w:p>
+        </w:tc>
+        <w:tc>
+          <w:tcPr>
+            <w:tcW w:w="2000" w:type="dxa"/>
+            <w:tcBorders>
+              <w:top w:val="single" w:sz="1" w:space="0" w:color="000000"/>
+              <w:left w:val="single" w:sz="1" w:space="0" w:color="000000"/>
+              <w:bottom w:val="single" w:sz="1" w:space="0" w:color="000000"/>
+              <w:right w:val="single" w:sz="1" w:space="0" w:color="000000"/>
+            </w:tcBorders>
+            <w:tcMar>
+              <w:top w:w="80" w:type="dxa"/>
+              <w:left w:w="120" w:type="dxa"/>
+              <w:bottom w:w="80" w:type="dxa"/>
+              <w:right w:w="120" w:type="dxa"/>
+            </w:tcMar>
+          </w:tcPr>
+          <w:p>
+            <w:pPr>
+              <w:spacing w:after="200"/>
+            </w:pPr>
+          </w:p>
+        </w:tc>
+        <w:tc>
+          <w:tcPr>
+            <w:tcW w:w="4160" w:type="dxa"/>
+            <w:tcBorders>
+              <w:top w:val="single" w:sz="1" w:space="0" w:color="000000"/>
+              <w:left w:val="single" w:sz="1" w:space="0" w:color="000000"/>
+              <w:bottom w:val="single" w:sz="1" w:space="0" w:color="000000"/>
+              <w:right w:val="single" w:sz="1" w:space="0" w:color="000000"/>
+            </w:tcBorders>
+            <w:tcMar>
+              <w:top w:w="80" w:type="dxa"/>
+              <w:left w:w="120" w:type="dxa"/>
+              <w:bottom w:w="80" w:type="dxa"/>
+              <w:right w:w="120" w:type="dxa"/>
+            </w:tcMar>
+          </w:tcPr>
+          <w:p>
+            <w:r>
+              <w:rPr>
+                <w:sz w:val="20"/>
+                <w:szCs w:val="20"/>
+              </w:rPr>
+              <w:t>Input processing time</w:t>
+            </w:r>
+          </w:p>
+        </w:tc>
+      </w:tr>
+      <w:tr>
+        <w:tblPrEx>
+          <w:tblCellMar>
+            <w:top w:w="0" w:type="dxa"/>
+            <w:bottom w:w="0" w:type="dxa"/>
+          </w:tblCellMar>
+        </w:tblPrEx>
+        <w:tc>
+          <w:tcPr>
+            <w:tcW w:w="3200" w:type="dxa"/>
+            <w:tcBorders>
+              <w:top w:val="single" w:sz="1" w:space="0" w:color="000000"/>
+              <w:left w:val="single" w:sz="1" w:space="0" w:color="000000"/>
+              <w:bottom w:val="single" w:sz="1" w:space="0" w:color="000000"/>
+              <w:right w:val="single" w:sz="1" w:space="0" w:color="000000"/>
+            </w:tcBorders>
+            <w:tcMar>
+              <w:top w:w="80" w:type="dxa"/>
+              <w:left w:w="120" w:type="dxa"/>
+              <w:bottom w:w="80" w:type="dxa"/>
+              <w:right w:w="120" w:type="dxa"/>
+            </w:tcMar>
+          </w:tcPr>
+          <w:p>
+            <w:r>
+              <w:rPr>
+                <w:sz w:val="20"/>
+                <w:szCs w:val="20"/>
+              </w:rPr>
+              <w:t>Prompt Eval Rate</w:t>
+            </w:r>
+          </w:p>
+        </w:tc>
+        <w:tc>
+          <w:tcPr>
+            <w:tcW w:w="2000" w:type="dxa"/>
+            <w:tcBorders>
+              <w:top w:val="single" w:sz="1" w:space="0" w:color="000000"/>
+              <w:left w:val="single" w:sz="1" w:space="0" w:color="000000"/>
+              <w:bottom w:val="single" w:sz="1" w:space="0" w:color="000000"/>
+              <w:right w:val="single" w:sz="1" w:space="0" w:color="000000"/>
+            </w:tcBorders>
+            <w:tcMar>
+              <w:top w:w="80" w:type="dxa"/>
+              <w:left w:w="120" w:type="dxa"/>
+              <w:bottom w:w="80" w:type="dxa"/>
+              <w:right w:w="120" w:type="dxa"/>
+            </w:tcMar>
+          </w:tcPr>
+          <w:p>
+            <w:pPr>
+              <w:spacing w:after="200"/>
+            </w:pPr>
+          </w:p>
+        </w:tc>
+        <w:tc>
+          <w:tcPr>
+            <w:tcW w:w="4160" w:type="dxa"/>
+            <w:tcBorders>
+              <w:top w:val="single" w:sz="1" w:space="0" w:color="000000"/>
+              <w:left w:val="single" w:sz="1" w:space="0" w:color="000000"/>
+              <w:bottom w:val="single" w:sz="1" w:space="0" w:color="000000"/>
+              <w:right w:val="single" w:sz="1" w:space="0" w:color="000000"/>
+            </w:tcBorders>
+            <w:tcMar>
+              <w:top w:w="80" w:type="dxa"/>
+              <w:left w:w="120" w:type="dxa"/>
+              <w:bottom w:w="80" w:type="dxa"/>
+              <w:right w:w="120" w:type="dxa"/>
+            </w:tcMar>
+          </w:tcPr>
+          <w:p>
+            <w:r>
+              <w:rPr>
+                <w:sz w:val="20"/>
+                <w:szCs w:val="20"/>
+              </w:rPr>
+              <w:t>Input processing speed (tokens/s)</w:t>
+            </w:r>
+          </w:p>
+        </w:tc>
+      </w:tr>
+      <w:tr>
+        <w:tblPrEx>
+          <w:tblCellMar>
+            <w:top w:w="0" w:type="dxa"/>
+            <w:bottom w:w="0" w:type="dxa"/>
+          </w:tblCellMar>
+        </w:tblPrEx>
+        <w:tc>
+          <w:tcPr>
+            <w:tcW w:w="3200" w:type="dxa"/>
+            <w:tcBorders>
+              <w:top w:val="single" w:sz="1" w:space="0" w:color="000000"/>
+              <w:left w:val="single" w:sz="1" w:space="0" w:color="000000"/>
+              <w:bottom w:val="single" w:sz="1" w:space="0" w:color="000000"/>
+              <w:right w:val="single" w:sz="1" w:space="0" w:color="000000"/>
+            </w:tcBorders>
+            <w:tcMar>
+              <w:top w:w="80" w:type="dxa"/>
+              <w:left w:w="120" w:type="dxa"/>
+              <w:bottom w:w="80" w:type="dxa"/>
+              <w:right w:w="120" w:type="dxa"/>
+            </w:tcMar>
+          </w:tcPr>
+          <w:p>
+            <w:r>
+              <w:rPr>
+                <w:sz w:val="20"/>
+                <w:szCs w:val="20"/>
+              </w:rPr>
+              <w:t>Eval Count</w:t>
+            </w:r>
+          </w:p>
+        </w:tc>
+        <w:tc>
+          <w:tcPr>
+            <w:tcW w:w="2000" w:type="dxa"/>
+            <w:tcBorders>
+              <w:top w:val="single" w:sz="1" w:space="0" w:color="000000"/>
+              <w:left w:val="single" w:sz="1" w:space="0" w:color="000000"/>
+              <w:bottom w:val="single" w:sz="1" w:space="0" w:color="000000"/>
+              <w:right w:val="single" w:sz="1" w:space="0" w:color="000000"/>
+            </w:tcBorders>
+            <w:tcMar>
+              <w:top w:w="80" w:type="dxa"/>
+              <w:left w:w="120" w:type="dxa"/>
+              <w:bottom w:w="80" w:type="dxa"/>
+              <w:right w:w="120" w:type="dxa"/>
+            </w:tcMar>
+          </w:tcPr>
+          <w:p>
+            <w:pPr>
+              <w:spacing w:after="200"/>
+            </w:pPr>
+          </w:p>
+        </w:tc>
+        <w:tc>
+          <w:tcPr>
+            <w:tcW w:w="4160" w:type="dxa"/>
+            <w:tcBorders>
+              <w:top w:val="single" w:sz="1" w:space="0" w:color="000000"/>
+              <w:left w:val="single" w:sz="1" w:space="0" w:color="000000"/>
+              <w:bottom w:val="single" w:sz="1" w:space="0" w:color="000000"/>
+              <w:right w:val="single" w:sz="1" w:space="0" w:color="000000"/>
+            </w:tcBorders>
+            <w:tcMar>
+              <w:top w:w="80" w:type="dxa"/>
+              <w:left w:w="120" w:type="dxa"/>
+              <w:bottom w:w="80" w:type="dxa"/>
+              <w:right w:w="120" w:type="dxa"/>
+            </w:tcMar>
+          </w:tcPr>
+          <w:p>
+            <w:r>
+              <w:rPr>
+                <w:sz w:val="20"/>
+                <w:szCs w:val="20"/>
+              </w:rPr>
+              <w:t>Number of output tokens</w:t>
+            </w:r>
+          </w:p>
+        </w:tc>
+      </w:tr>
+      <w:tr>
+        <w:tblPrEx>
+          <w:tblCellMar>
+            <w:top w:w="0" w:type="dxa"/>
+            <w:bottom w:w="0" w:type="dxa"/>
+          </w:tblCellMar>
+        </w:tblPrEx>
+        <w:tc>
+          <w:tcPr>
+            <w:tcW w:w="3200" w:type="dxa"/>
+            <w:tcBorders>
+              <w:top w:val="single" w:sz="1" w:space="0" w:color="000000"/>
+              <w:left w:val="single" w:sz="1" w:space="0" w:color="000000"/>
+              <w:bottom w:val="single" w:sz="1" w:space="0" w:color="000000"/>
+              <w:right w:val="single" w:sz="1" w:space="0" w:color="000000"/>
+            </w:tcBorders>
+            <w:tcMar>
+              <w:top w:w="80" w:type="dxa"/>
+              <w:left w:w="120" w:type="dxa"/>
+              <w:bottom w:w="80" w:type="dxa"/>
+              <w:right w:w="120" w:type="dxa"/>
+            </w:tcMar>
+          </w:tcPr>
+          <w:p>
+            <w:r>
+              <w:rPr>
+                <w:sz w:val="20"/>
+                <w:szCs w:val="20"/>
+              </w:rPr>
+              <w:t>Eval Duration</w:t>
+            </w:r>
+          </w:p>
+        </w:tc>
+        <w:tc>
+          <w:tcPr>
+            <w:tcW w:w="2000" w:type="dxa"/>
+            <w:tcBorders>
+              <w:top w:val="single" w:sz="1" w:space="0" w:color="000000"/>
+              <w:left w:val="single" w:sz="1" w:space="0" w:color="000000"/>
+              <w:bottom w:val="single" w:sz="1" w:space="0" w:color="000000"/>
+              <w:right w:val="single" w:sz="1" w:space="0" w:color="000000"/>
+            </w:tcBorders>
+            <w:tcMar>
+              <w:top w:w="80" w:type="dxa"/>
+              <w:left w:w="120" w:type="dxa"/>
+              <w:bottom w:w="80" w:type="dxa"/>
+              <w:right w:w="120" w:type="dxa"/>
+            </w:tcMar>
+          </w:tcPr>
+          <w:p>
+            <w:pPr>
+              <w:spacing w:after="200"/>
+            </w:pPr>
+          </w:p>
+        </w:tc>
+        <w:tc>
+          <w:tcPr>
+            <w:tcW w:w="4160" w:type="dxa"/>
+            <w:tcBorders>
+              <w:top w:val="single" w:sz="1" w:space="0" w:color="000000"/>
+              <w:left w:val="single" w:sz="1" w:space="0" w:color="000000"/>
+              <w:bottom w:val="single" w:sz="1" w:space="0" w:color="000000"/>
+              <w:right w:val="single" w:sz="1" w:space="0" w:color="000000"/>
+            </w:tcBorders>
+            <w:tcMar>
+              <w:top w:w="80" w:type="dxa"/>
+              <w:left w:w="120" w:type="dxa"/>
+              <w:bottom w:w="80" w:type="dxa"/>
+              <w:right w:w="120" w:type="dxa"/>
+            </w:tcMar>
+          </w:tcPr>
+          <w:p>
+            <w:r>
+              <w:rPr>
+                <w:sz w:val="20"/>
+                <w:szCs w:val="20"/>
+              </w:rPr>
+              <w:t>Output generation time</w:t>
+            </w:r>
+          </w:p>
+        </w:tc>
+      </w:tr>
+      <w:tr>
+        <w:tblPrEx>
+          <w:tblCellMar>
+            <w:top w:w="0" w:type="dxa"/>
+            <w:bottom w:w="0" w:type="dxa"/>
+          </w:tblCellMar>
+        </w:tblPrEx>
+        <w:tc>
+          <w:tcPr>
+            <w:tcW w:w="3200" w:type="dxa"/>
+            <w:tcBorders>
+              <w:top w:val="single" w:sz="1" w:space="0" w:color="000000"/>
+              <w:left w:val="single" w:sz="1" w:space="0" w:color="000000"/>
+              <w:bottom w:val="single" w:sz="1" w:space="0" w:color="000000"/>
+              <w:right w:val="single" w:sz="1" w:space="0" w:color="000000"/>
+            </w:tcBorders>
+            <w:tcMar>
+              <w:top w:w="80" w:type="dxa"/>
+              <w:left w:w="120" w:type="dxa"/>
+              <w:bottom w:w="80" w:type="dxa"/>
+              <w:right w:w="120" w:type="dxa"/>
+            </w:tcMar>
+          </w:tcPr>
+          <w:p>
+            <w:r>
+              <w:rPr>
+                <w:sz w:val="20"/>
+                <w:szCs w:val="20"/>
+              </w:rPr>
+              <w:lastRenderedPageBreak/>
+              <w:t>Eval Rate</w:t>
+            </w:r>
+          </w:p>
+        </w:tc>
+        <w:tc>
+          <w:tcPr>
+            <w:tcW w:w="2000" w:type="dxa"/>
+            <w:tcBorders>
+              <w:top w:val="single" w:sz="1" w:space="0" w:color="000000"/>
+              <w:left w:val="single" w:sz="1" w:space="0" w:color="000000"/>
+              <w:bottom w:val="single" w:sz="1" w:space="0" w:color="000000"/>
+              <w:right w:val="single" w:sz="1" w:space="0" w:color="000000"/>
+            </w:tcBorders>
+            <w:tcMar>
+              <w:top w:w="80" w:type="dxa"/>
+              <w:left w:w="120" w:type="dxa"/>
+              <w:bottom w:w="80" w:type="dxa"/>
+              <w:right w:w="120" w:type="dxa"/>
+            </w:tcMar>
+          </w:tcPr>
+          <w:p>
+            <w:pPr>
+              <w:spacing w:after="200"/>
+            </w:pPr>
+          </w:p>
+        </w:tc>
+        <w:tc>
+          <w:tcPr>
+            <w:tcW w:w="4160" w:type="dxa"/>
+            <w:tcBorders>
+              <w:top w:val="single" w:sz="1" w:space="0" w:color="000000"/>
+              <w:left w:val="single" w:sz="1" w:space="0" w:color="000000"/>
+              <w:bottom w:val="single" w:sz="1" w:space="0" w:color="000000"/>
+              <w:right w:val="single" w:sz="1" w:space="0" w:color="000000"/>
+            </w:tcBorders>
+            <w:tcMar>
+              <w:top w:w="80" w:type="dxa"/>
+              <w:left w:w="120" w:type="dxa"/>
+              <w:bottom w:w="80" w:type="dxa"/>
+              <w:right w:w="120" w:type="dxa"/>
+            </w:tcMar>
+          </w:tcPr>
+          <w:p>
+            <w:r>
+              <w:rPr>
+                <w:sz w:val="20"/>
+                <w:szCs w:val="20"/>
+              </w:rPr>
+              <w:t>Output generation speed (tokens/s)</w:t>
+            </w:r>
+          </w:p>
+        </w:tc>
+      </w:tr>
+    </w:tbl>
+    <w:p>
+      <w:pPr>
+        <w:spacing w:before="100" w:after="100"/>
+      </w:pPr>
+    </w:p>
+    <w:p>
+      <w:pPr>
+        <w:pStyle w:val="Heading2"/>
+        <w:spacing w:before="300" w:after="100"/>
+      </w:pPr>
+      <w:r>
         <w:t>Jetson Orin Nano — Model 1: llama3.2:1b</w:t>
       </w:r>
     </w:p>
@@ -2663,7 +3452,6 @@
                 <w:sz w:val="20"/>
                 <w:szCs w:val="20"/>
               </w:rPr>
-              <w:lastRenderedPageBreak/>
               <w:t>Eval Rate</w:t>
             </w:r>
           </w:p>
@@ -3452,6 +4240,795 @@
                 <w:sz w:val="20"/>
                 <w:szCs w:val="20"/>
               </w:rPr>
+              <w:lastRenderedPageBreak/>
+              <w:t>Eval Rate</w:t>
+            </w:r>
+          </w:p>
+        </w:tc>
+        <w:tc>
+          <w:tcPr>
+            <w:tcW w:w="2000" w:type="dxa"/>
+            <w:tcBorders>
+              <w:top w:val="single" w:sz="1" w:space="0" w:color="000000"/>
+              <w:left w:val="single" w:sz="1" w:space="0" w:color="000000"/>
+              <w:bottom w:val="single" w:sz="1" w:space="0" w:color="000000"/>
+              <w:right w:val="single" w:sz="1" w:space="0" w:color="000000"/>
+            </w:tcBorders>
+            <w:tcMar>
+              <w:top w:w="80" w:type="dxa"/>
+              <w:left w:w="120" w:type="dxa"/>
+              <w:bottom w:w="80" w:type="dxa"/>
+              <w:right w:w="120" w:type="dxa"/>
+            </w:tcMar>
+          </w:tcPr>
+          <w:p>
+            <w:pPr>
+              <w:spacing w:after="200"/>
+            </w:pPr>
+          </w:p>
+        </w:tc>
+        <w:tc>
+          <w:tcPr>
+            <w:tcW w:w="4160" w:type="dxa"/>
+            <w:tcBorders>
+              <w:top w:val="single" w:sz="1" w:space="0" w:color="000000"/>
+              <w:left w:val="single" w:sz="1" w:space="0" w:color="000000"/>
+              <w:bottom w:val="single" w:sz="1" w:space="0" w:color="000000"/>
+              <w:right w:val="single" w:sz="1" w:space="0" w:color="000000"/>
+            </w:tcBorders>
+            <w:tcMar>
+              <w:top w:w="80" w:type="dxa"/>
+              <w:left w:w="120" w:type="dxa"/>
+              <w:bottom w:w="80" w:type="dxa"/>
+              <w:right w:w="120" w:type="dxa"/>
+            </w:tcMar>
+          </w:tcPr>
+          <w:p>
+            <w:r>
+              <w:rPr>
+                <w:sz w:val="20"/>
+                <w:szCs w:val="20"/>
+              </w:rPr>
+              <w:t>Output generation speed (tokens/s)</w:t>
+            </w:r>
+          </w:p>
+        </w:tc>
+      </w:tr>
+    </w:tbl>
+    <w:p>
+      <w:pPr>
+        <w:spacing w:before="100" w:after="100"/>
+      </w:pPr>
+    </w:p>
+    <w:p>
+      <w:pPr>
+        <w:pStyle w:val="Heading2"/>
+        <w:spacing w:before="300" w:after="100"/>
+      </w:pPr>
+      <w:r>
+        <w:t>Jetson Orin Nano — Model 3: deepseek-r1:7b</w:t>
+      </w:r>
+    </w:p>
+    <w:tbl>
+      <w:tblPr>
+        <w:tblW w:w="9360" w:type="dxa"/>
+        <w:tblBorders>
+          <w:top w:val="single" w:sz="4" w:space="0" w:color="auto"/>
+          <w:left w:val="single" w:sz="4" w:space="0" w:color="auto"/>
+          <w:bottom w:val="single" w:sz="4" w:space="0" w:color="auto"/>
+          <w:right w:val="single" w:sz="4" w:space="0" w:color="auto"/>
+          <w:insideH w:val="single" w:sz="4" w:space="0" w:color="auto"/>
+          <w:insideV w:val="single" w:sz="4" w:space="0" w:color="auto"/>
+        </w:tblBorders>
+        <w:tblCellMar>
+          <w:left w:w="10" w:type="dxa"/>
+          <w:right w:w="10" w:type="dxa"/>
+        </w:tblCellMar>
+        <w:tblLook w:val="04A0" w:firstRow="1" w:lastRow="0" w:firstColumn="1" w:lastColumn="0" w:noHBand="0" w:noVBand="1"/>
+      </w:tblPr>
+      <w:tblGrid>
+        <w:gridCol w:w="3200"/>
+        <w:gridCol w:w="2000"/>
+        <w:gridCol w:w="4160"/>
+      </w:tblGrid>
+      <w:tr>
+        <w:tblPrEx>
+          <w:tblCellMar>
+            <w:top w:w="0" w:type="dxa"/>
+            <w:bottom w:w="0" w:type="dxa"/>
+          </w:tblCellMar>
+        </w:tblPrEx>
+        <w:tc>
+          <w:tcPr>
+            <w:tcW w:w="3200" w:type="dxa"/>
+            <w:tcBorders>
+              <w:top w:val="single" w:sz="1" w:space="0" w:color="000000"/>
+              <w:left w:val="single" w:sz="1" w:space="0" w:color="000000"/>
+              <w:bottom w:val="single" w:sz="1" w:space="0" w:color="000000"/>
+              <w:right w:val="single" w:sz="1" w:space="0" w:color="000000"/>
+            </w:tcBorders>
+            <w:shd w:val="clear" w:color="auto" w:fill="D5E8F0"/>
+            <w:tcMar>
+              <w:top w:w="80" w:type="dxa"/>
+              <w:left w:w="120" w:type="dxa"/>
+              <w:bottom w:w="80" w:type="dxa"/>
+              <w:right w:w="120" w:type="dxa"/>
+            </w:tcMar>
+          </w:tcPr>
+          <w:p>
+            <w:r>
+              <w:rPr>
+                <w:b/>
+                <w:bCs/>
+                <w:sz w:val="20"/>
+                <w:szCs w:val="20"/>
+              </w:rPr>
+              <w:t>Metric</w:t>
+            </w:r>
+          </w:p>
+        </w:tc>
+        <w:tc>
+          <w:tcPr>
+            <w:tcW w:w="2000" w:type="dxa"/>
+            <w:tcBorders>
+              <w:top w:val="single" w:sz="1" w:space="0" w:color="000000"/>
+              <w:left w:val="single" w:sz="1" w:space="0" w:color="000000"/>
+              <w:bottom w:val="single" w:sz="1" w:space="0" w:color="000000"/>
+              <w:right w:val="single" w:sz="1" w:space="0" w:color="000000"/>
+            </w:tcBorders>
+            <w:shd w:val="clear" w:color="auto" w:fill="D5E8F0"/>
+            <w:tcMar>
+              <w:top w:w="80" w:type="dxa"/>
+              <w:left w:w="120" w:type="dxa"/>
+              <w:bottom w:w="80" w:type="dxa"/>
+              <w:right w:w="120" w:type="dxa"/>
+            </w:tcMar>
+          </w:tcPr>
+          <w:p>
+            <w:r>
+              <w:rPr>
+                <w:b/>
+                <w:bCs/>
+                <w:sz w:val="20"/>
+                <w:szCs w:val="20"/>
+              </w:rPr>
+              <w:t>Value</w:t>
+            </w:r>
+          </w:p>
+        </w:tc>
+        <w:tc>
+          <w:tcPr>
+            <w:tcW w:w="4160" w:type="dxa"/>
+            <w:tcBorders>
+              <w:top w:val="single" w:sz="1" w:space="0" w:color="000000"/>
+              <w:left w:val="single" w:sz="1" w:space="0" w:color="000000"/>
+              <w:bottom w:val="single" w:sz="1" w:space="0" w:color="000000"/>
+              <w:right w:val="single" w:sz="1" w:space="0" w:color="000000"/>
+            </w:tcBorders>
+            <w:shd w:val="clear" w:color="auto" w:fill="D5E8F0"/>
+            <w:tcMar>
+              <w:top w:w="80" w:type="dxa"/>
+              <w:left w:w="120" w:type="dxa"/>
+              <w:bottom w:w="80" w:type="dxa"/>
+              <w:right w:w="120" w:type="dxa"/>
+            </w:tcMar>
+          </w:tcPr>
+          <w:p>
+            <w:r>
+              <w:rPr>
+                <w:b/>
+                <w:bCs/>
+                <w:sz w:val="20"/>
+                <w:szCs w:val="20"/>
+              </w:rPr>
+              <w:t>Description</w:t>
+            </w:r>
+          </w:p>
+        </w:tc>
+      </w:tr>
+      <w:tr>
+        <w:tblPrEx>
+          <w:tblCellMar>
+            <w:top w:w="0" w:type="dxa"/>
+            <w:bottom w:w="0" w:type="dxa"/>
+          </w:tblCellMar>
+        </w:tblPrEx>
+        <w:tc>
+          <w:tcPr>
+            <w:tcW w:w="3200" w:type="dxa"/>
+            <w:tcBorders>
+              <w:top w:val="single" w:sz="1" w:space="0" w:color="000000"/>
+              <w:left w:val="single" w:sz="1" w:space="0" w:color="000000"/>
+              <w:bottom w:val="single" w:sz="1" w:space="0" w:color="000000"/>
+              <w:right w:val="single" w:sz="1" w:space="0" w:color="000000"/>
+            </w:tcBorders>
+            <w:tcMar>
+              <w:top w:w="80" w:type="dxa"/>
+              <w:left w:w="120" w:type="dxa"/>
+              <w:bottom w:w="80" w:type="dxa"/>
+              <w:right w:w="120" w:type="dxa"/>
+            </w:tcMar>
+          </w:tcPr>
+          <w:p>
+            <w:r>
+              <w:rPr>
+                <w:sz w:val="20"/>
+                <w:szCs w:val="20"/>
+              </w:rPr>
+              <w:t>Total Duration</w:t>
+            </w:r>
+          </w:p>
+        </w:tc>
+        <w:tc>
+          <w:tcPr>
+            <w:tcW w:w="2000" w:type="dxa"/>
+            <w:tcBorders>
+              <w:top w:val="single" w:sz="1" w:space="0" w:color="000000"/>
+              <w:left w:val="single" w:sz="1" w:space="0" w:color="000000"/>
+              <w:bottom w:val="single" w:sz="1" w:space="0" w:color="000000"/>
+              <w:right w:val="single" w:sz="1" w:space="0" w:color="000000"/>
+            </w:tcBorders>
+            <w:tcMar>
+              <w:top w:w="80" w:type="dxa"/>
+              <w:left w:w="120" w:type="dxa"/>
+              <w:bottom w:w="80" w:type="dxa"/>
+              <w:right w:w="120" w:type="dxa"/>
+            </w:tcMar>
+          </w:tcPr>
+          <w:p>
+            <w:pPr>
+              <w:spacing w:after="200"/>
+            </w:pPr>
+          </w:p>
+        </w:tc>
+        <w:tc>
+          <w:tcPr>
+            <w:tcW w:w="4160" w:type="dxa"/>
+            <w:tcBorders>
+              <w:top w:val="single" w:sz="1" w:space="0" w:color="000000"/>
+              <w:left w:val="single" w:sz="1" w:space="0" w:color="000000"/>
+              <w:bottom w:val="single" w:sz="1" w:space="0" w:color="000000"/>
+              <w:right w:val="single" w:sz="1" w:space="0" w:color="000000"/>
+            </w:tcBorders>
+            <w:tcMar>
+              <w:top w:w="80" w:type="dxa"/>
+              <w:left w:w="120" w:type="dxa"/>
+              <w:bottom w:w="80" w:type="dxa"/>
+              <w:right w:w="120" w:type="dxa"/>
+            </w:tcMar>
+          </w:tcPr>
+          <w:p>
+            <w:r>
+              <w:rPr>
+                <w:sz w:val="20"/>
+                <w:szCs w:val="20"/>
+              </w:rPr>
+              <w:t>Full execution time</w:t>
+            </w:r>
+          </w:p>
+        </w:tc>
+      </w:tr>
+      <w:tr>
+        <w:tblPrEx>
+          <w:tblCellMar>
+            <w:top w:w="0" w:type="dxa"/>
+            <w:bottom w:w="0" w:type="dxa"/>
+          </w:tblCellMar>
+        </w:tblPrEx>
+        <w:tc>
+          <w:tcPr>
+            <w:tcW w:w="3200" w:type="dxa"/>
+            <w:tcBorders>
+              <w:top w:val="single" w:sz="1" w:space="0" w:color="000000"/>
+              <w:left w:val="single" w:sz="1" w:space="0" w:color="000000"/>
+              <w:bottom w:val="single" w:sz="1" w:space="0" w:color="000000"/>
+              <w:right w:val="single" w:sz="1" w:space="0" w:color="000000"/>
+            </w:tcBorders>
+            <w:tcMar>
+              <w:top w:w="80" w:type="dxa"/>
+              <w:left w:w="120" w:type="dxa"/>
+              <w:bottom w:w="80" w:type="dxa"/>
+              <w:right w:w="120" w:type="dxa"/>
+            </w:tcMar>
+          </w:tcPr>
+          <w:p>
+            <w:r>
+              <w:rPr>
+                <w:sz w:val="20"/>
+                <w:szCs w:val="20"/>
+              </w:rPr>
+              <w:t>Load Duration</w:t>
+            </w:r>
+          </w:p>
+        </w:tc>
+        <w:tc>
+          <w:tcPr>
+            <w:tcW w:w="2000" w:type="dxa"/>
+            <w:tcBorders>
+              <w:top w:val="single" w:sz="1" w:space="0" w:color="000000"/>
+              <w:left w:val="single" w:sz="1" w:space="0" w:color="000000"/>
+              <w:bottom w:val="single" w:sz="1" w:space="0" w:color="000000"/>
+              <w:right w:val="single" w:sz="1" w:space="0" w:color="000000"/>
+            </w:tcBorders>
+            <w:tcMar>
+              <w:top w:w="80" w:type="dxa"/>
+              <w:left w:w="120" w:type="dxa"/>
+              <w:bottom w:w="80" w:type="dxa"/>
+              <w:right w:w="120" w:type="dxa"/>
+            </w:tcMar>
+          </w:tcPr>
+          <w:p>
+            <w:pPr>
+              <w:spacing w:after="200"/>
+            </w:pPr>
+          </w:p>
+        </w:tc>
+        <w:tc>
+          <w:tcPr>
+            <w:tcW w:w="4160" w:type="dxa"/>
+            <w:tcBorders>
+              <w:top w:val="single" w:sz="1" w:space="0" w:color="000000"/>
+              <w:left w:val="single" w:sz="1" w:space="0" w:color="000000"/>
+              <w:bottom w:val="single" w:sz="1" w:space="0" w:color="000000"/>
+              <w:right w:val="single" w:sz="1" w:space="0" w:color="000000"/>
+            </w:tcBorders>
+            <w:tcMar>
+              <w:top w:w="80" w:type="dxa"/>
+              <w:left w:w="120" w:type="dxa"/>
+              <w:bottom w:w="80" w:type="dxa"/>
+              <w:right w:w="120" w:type="dxa"/>
+            </w:tcMar>
+          </w:tcPr>
+          <w:p>
+            <w:r>
+              <w:rPr>
+                <w:sz w:val="20"/>
+                <w:szCs w:val="20"/>
+              </w:rPr>
+              <w:t>Model loading time</w:t>
+            </w:r>
+          </w:p>
+        </w:tc>
+      </w:tr>
+      <w:tr>
+        <w:tblPrEx>
+          <w:tblCellMar>
+            <w:top w:w="0" w:type="dxa"/>
+            <w:bottom w:w="0" w:type="dxa"/>
+          </w:tblCellMar>
+        </w:tblPrEx>
+        <w:tc>
+          <w:tcPr>
+            <w:tcW w:w="3200" w:type="dxa"/>
+            <w:tcBorders>
+              <w:top w:val="single" w:sz="1" w:space="0" w:color="000000"/>
+              <w:left w:val="single" w:sz="1" w:space="0" w:color="000000"/>
+              <w:bottom w:val="single" w:sz="1" w:space="0" w:color="000000"/>
+              <w:right w:val="single" w:sz="1" w:space="0" w:color="000000"/>
+            </w:tcBorders>
+            <w:tcMar>
+              <w:top w:w="80" w:type="dxa"/>
+              <w:left w:w="120" w:type="dxa"/>
+              <w:bottom w:w="80" w:type="dxa"/>
+              <w:right w:w="120" w:type="dxa"/>
+            </w:tcMar>
+          </w:tcPr>
+          <w:p>
+            <w:r>
+              <w:rPr>
+                <w:sz w:val="20"/>
+                <w:szCs w:val="20"/>
+              </w:rPr>
+              <w:t>Prompt Eval Count</w:t>
+            </w:r>
+          </w:p>
+        </w:tc>
+        <w:tc>
+          <w:tcPr>
+            <w:tcW w:w="2000" w:type="dxa"/>
+            <w:tcBorders>
+              <w:top w:val="single" w:sz="1" w:space="0" w:color="000000"/>
+              <w:left w:val="single" w:sz="1" w:space="0" w:color="000000"/>
+              <w:bottom w:val="single" w:sz="1" w:space="0" w:color="000000"/>
+              <w:right w:val="single" w:sz="1" w:space="0" w:color="000000"/>
+            </w:tcBorders>
+            <w:tcMar>
+              <w:top w:w="80" w:type="dxa"/>
+              <w:left w:w="120" w:type="dxa"/>
+              <w:bottom w:w="80" w:type="dxa"/>
+              <w:right w:w="120" w:type="dxa"/>
+            </w:tcMar>
+          </w:tcPr>
+          <w:p>
+            <w:pPr>
+              <w:spacing w:after="200"/>
+            </w:pPr>
+          </w:p>
+        </w:tc>
+        <w:tc>
+          <w:tcPr>
+            <w:tcW w:w="4160" w:type="dxa"/>
+            <w:tcBorders>
+              <w:top w:val="single" w:sz="1" w:space="0" w:color="000000"/>
+              <w:left w:val="single" w:sz="1" w:space="0" w:color="000000"/>
+              <w:bottom w:val="single" w:sz="1" w:space="0" w:color="000000"/>
+              <w:right w:val="single" w:sz="1" w:space="0" w:color="000000"/>
+            </w:tcBorders>
+            <w:tcMar>
+              <w:top w:w="80" w:type="dxa"/>
+              <w:left w:w="120" w:type="dxa"/>
+              <w:bottom w:w="80" w:type="dxa"/>
+              <w:right w:w="120" w:type="dxa"/>
+            </w:tcMar>
+          </w:tcPr>
+          <w:p>
+            <w:r>
+              <w:rPr>
+                <w:sz w:val="20"/>
+                <w:szCs w:val="20"/>
+              </w:rPr>
+              <w:t>Number of input tokens</w:t>
+            </w:r>
+          </w:p>
+        </w:tc>
+      </w:tr>
+      <w:tr>
+        <w:tblPrEx>
+          <w:tblCellMar>
+            <w:top w:w="0" w:type="dxa"/>
+            <w:bottom w:w="0" w:type="dxa"/>
+          </w:tblCellMar>
+        </w:tblPrEx>
+        <w:tc>
+          <w:tcPr>
+            <w:tcW w:w="3200" w:type="dxa"/>
+            <w:tcBorders>
+              <w:top w:val="single" w:sz="1" w:space="0" w:color="000000"/>
+              <w:left w:val="single" w:sz="1" w:space="0" w:color="000000"/>
+              <w:bottom w:val="single" w:sz="1" w:space="0" w:color="000000"/>
+              <w:right w:val="single" w:sz="1" w:space="0" w:color="000000"/>
+            </w:tcBorders>
+            <w:tcMar>
+              <w:top w:w="80" w:type="dxa"/>
+              <w:left w:w="120" w:type="dxa"/>
+              <w:bottom w:w="80" w:type="dxa"/>
+              <w:right w:w="120" w:type="dxa"/>
+            </w:tcMar>
+          </w:tcPr>
+          <w:p>
+            <w:r>
+              <w:rPr>
+                <w:sz w:val="20"/>
+                <w:szCs w:val="20"/>
+              </w:rPr>
+              <w:t>Prompt Eval Duration</w:t>
+            </w:r>
+          </w:p>
+        </w:tc>
+        <w:tc>
+          <w:tcPr>
+            <w:tcW w:w="2000" w:type="dxa"/>
+            <w:tcBorders>
+              <w:top w:val="single" w:sz="1" w:space="0" w:color="000000"/>
+              <w:left w:val="single" w:sz="1" w:space="0" w:color="000000"/>
+              <w:bottom w:val="single" w:sz="1" w:space="0" w:color="000000"/>
+              <w:right w:val="single" w:sz="1" w:space="0" w:color="000000"/>
+            </w:tcBorders>
+            <w:tcMar>
+              <w:top w:w="80" w:type="dxa"/>
+              <w:left w:w="120" w:type="dxa"/>
+              <w:bottom w:w="80" w:type="dxa"/>
+              <w:right w:w="120" w:type="dxa"/>
+            </w:tcMar>
+          </w:tcPr>
+          <w:p>
+            <w:pPr>
+              <w:spacing w:after="200"/>
+            </w:pPr>
+          </w:p>
+        </w:tc>
+        <w:tc>
+          <w:tcPr>
+            <w:tcW w:w="4160" w:type="dxa"/>
+            <w:tcBorders>
+              <w:top w:val="single" w:sz="1" w:space="0" w:color="000000"/>
+              <w:left w:val="single" w:sz="1" w:space="0" w:color="000000"/>
+              <w:bottom w:val="single" w:sz="1" w:space="0" w:color="000000"/>
+              <w:right w:val="single" w:sz="1" w:space="0" w:color="000000"/>
+            </w:tcBorders>
+            <w:tcMar>
+              <w:top w:w="80" w:type="dxa"/>
+              <w:left w:w="120" w:type="dxa"/>
+              <w:bottom w:w="80" w:type="dxa"/>
+              <w:right w:w="120" w:type="dxa"/>
+            </w:tcMar>
+          </w:tcPr>
+          <w:p>
+            <w:r>
+              <w:rPr>
+                <w:sz w:val="20"/>
+                <w:szCs w:val="20"/>
+              </w:rPr>
+              <w:t>Input processing time</w:t>
+            </w:r>
+          </w:p>
+        </w:tc>
+      </w:tr>
+      <w:tr>
+        <w:tblPrEx>
+          <w:tblCellMar>
+            <w:top w:w="0" w:type="dxa"/>
+            <w:bottom w:w="0" w:type="dxa"/>
+          </w:tblCellMar>
+        </w:tblPrEx>
+        <w:tc>
+          <w:tcPr>
+            <w:tcW w:w="3200" w:type="dxa"/>
+            <w:tcBorders>
+              <w:top w:val="single" w:sz="1" w:space="0" w:color="000000"/>
+              <w:left w:val="single" w:sz="1" w:space="0" w:color="000000"/>
+              <w:bottom w:val="single" w:sz="1" w:space="0" w:color="000000"/>
+              <w:right w:val="single" w:sz="1" w:space="0" w:color="000000"/>
+            </w:tcBorders>
+            <w:tcMar>
+              <w:top w:w="80" w:type="dxa"/>
+              <w:left w:w="120" w:type="dxa"/>
+              <w:bottom w:w="80" w:type="dxa"/>
+              <w:right w:w="120" w:type="dxa"/>
+            </w:tcMar>
+          </w:tcPr>
+          <w:p>
+            <w:r>
+              <w:rPr>
+                <w:sz w:val="20"/>
+                <w:szCs w:val="20"/>
+              </w:rPr>
+              <w:t>Prompt Eval Rate</w:t>
+            </w:r>
+          </w:p>
+        </w:tc>
+        <w:tc>
+          <w:tcPr>
+            <w:tcW w:w="2000" w:type="dxa"/>
+            <w:tcBorders>
+              <w:top w:val="single" w:sz="1" w:space="0" w:color="000000"/>
+              <w:left w:val="single" w:sz="1" w:space="0" w:color="000000"/>
+              <w:bottom w:val="single" w:sz="1" w:space="0" w:color="000000"/>
+              <w:right w:val="single" w:sz="1" w:space="0" w:color="000000"/>
+            </w:tcBorders>
+            <w:tcMar>
+              <w:top w:w="80" w:type="dxa"/>
+              <w:left w:w="120" w:type="dxa"/>
+              <w:bottom w:w="80" w:type="dxa"/>
+              <w:right w:w="120" w:type="dxa"/>
+            </w:tcMar>
+          </w:tcPr>
+          <w:p>
+            <w:pPr>
+              <w:spacing w:after="200"/>
+            </w:pPr>
+          </w:p>
+        </w:tc>
+        <w:tc>
+          <w:tcPr>
+            <w:tcW w:w="4160" w:type="dxa"/>
+            <w:tcBorders>
+              <w:top w:val="single" w:sz="1" w:space="0" w:color="000000"/>
+              <w:left w:val="single" w:sz="1" w:space="0" w:color="000000"/>
+              <w:bottom w:val="single" w:sz="1" w:space="0" w:color="000000"/>
+              <w:right w:val="single" w:sz="1" w:space="0" w:color="000000"/>
+            </w:tcBorders>
+            <w:tcMar>
+              <w:top w:w="80" w:type="dxa"/>
+              <w:left w:w="120" w:type="dxa"/>
+              <w:bottom w:w="80" w:type="dxa"/>
+              <w:right w:w="120" w:type="dxa"/>
+            </w:tcMar>
+          </w:tcPr>
+          <w:p>
+            <w:r>
+              <w:rPr>
+                <w:sz w:val="20"/>
+                <w:szCs w:val="20"/>
+              </w:rPr>
+              <w:t>Input processing speed (tokens/s)</w:t>
+            </w:r>
+          </w:p>
+        </w:tc>
+      </w:tr>
+      <w:tr>
+        <w:tblPrEx>
+          <w:tblCellMar>
+            <w:top w:w="0" w:type="dxa"/>
+            <w:bottom w:w="0" w:type="dxa"/>
+          </w:tblCellMar>
+        </w:tblPrEx>
+        <w:tc>
+          <w:tcPr>
+            <w:tcW w:w="3200" w:type="dxa"/>
+            <w:tcBorders>
+              <w:top w:val="single" w:sz="1" w:space="0" w:color="000000"/>
+              <w:left w:val="single" w:sz="1" w:space="0" w:color="000000"/>
+              <w:bottom w:val="single" w:sz="1" w:space="0" w:color="000000"/>
+              <w:right w:val="single" w:sz="1" w:space="0" w:color="000000"/>
+            </w:tcBorders>
+            <w:tcMar>
+              <w:top w:w="80" w:type="dxa"/>
+              <w:left w:w="120" w:type="dxa"/>
+              <w:bottom w:w="80" w:type="dxa"/>
+              <w:right w:w="120" w:type="dxa"/>
+            </w:tcMar>
+          </w:tcPr>
+          <w:p>
+            <w:r>
+              <w:rPr>
+                <w:sz w:val="20"/>
+                <w:szCs w:val="20"/>
+              </w:rPr>
+              <w:t>Eval Count</w:t>
+            </w:r>
+          </w:p>
+        </w:tc>
+        <w:tc>
+          <w:tcPr>
+            <w:tcW w:w="2000" w:type="dxa"/>
+            <w:tcBorders>
+              <w:top w:val="single" w:sz="1" w:space="0" w:color="000000"/>
+              <w:left w:val="single" w:sz="1" w:space="0" w:color="000000"/>
+              <w:bottom w:val="single" w:sz="1" w:space="0" w:color="000000"/>
+              <w:right w:val="single" w:sz="1" w:space="0" w:color="000000"/>
+            </w:tcBorders>
+            <w:tcMar>
+              <w:top w:w="80" w:type="dxa"/>
+              <w:left w:w="120" w:type="dxa"/>
+              <w:bottom w:w="80" w:type="dxa"/>
+              <w:right w:w="120" w:type="dxa"/>
+            </w:tcMar>
+          </w:tcPr>
+          <w:p>
+            <w:pPr>
+              <w:spacing w:after="200"/>
+            </w:pPr>
+          </w:p>
+        </w:tc>
+        <w:tc>
+          <w:tcPr>
+            <w:tcW w:w="4160" w:type="dxa"/>
+            <w:tcBorders>
+              <w:top w:val="single" w:sz="1" w:space="0" w:color="000000"/>
+              <w:left w:val="single" w:sz="1" w:space="0" w:color="000000"/>
+              <w:bottom w:val="single" w:sz="1" w:space="0" w:color="000000"/>
+              <w:right w:val="single" w:sz="1" w:space="0" w:color="000000"/>
+            </w:tcBorders>
+            <w:tcMar>
+              <w:top w:w="80" w:type="dxa"/>
+              <w:left w:w="120" w:type="dxa"/>
+              <w:bottom w:w="80" w:type="dxa"/>
+              <w:right w:w="120" w:type="dxa"/>
+            </w:tcMar>
+          </w:tcPr>
+          <w:p>
+            <w:r>
+              <w:rPr>
+                <w:sz w:val="20"/>
+                <w:szCs w:val="20"/>
+              </w:rPr>
+              <w:t>Number of output tokens</w:t>
+            </w:r>
+          </w:p>
+        </w:tc>
+      </w:tr>
+      <w:tr>
+        <w:tblPrEx>
+          <w:tblCellMar>
+            <w:top w:w="0" w:type="dxa"/>
+            <w:bottom w:w="0" w:type="dxa"/>
+          </w:tblCellMar>
+        </w:tblPrEx>
+        <w:tc>
+          <w:tcPr>
+            <w:tcW w:w="3200" w:type="dxa"/>
+            <w:tcBorders>
+              <w:top w:val="single" w:sz="1" w:space="0" w:color="000000"/>
+              <w:left w:val="single" w:sz="1" w:space="0" w:color="000000"/>
+              <w:bottom w:val="single" w:sz="1" w:space="0" w:color="000000"/>
+              <w:right w:val="single" w:sz="1" w:space="0" w:color="000000"/>
+            </w:tcBorders>
+            <w:tcMar>
+              <w:top w:w="80" w:type="dxa"/>
+              <w:left w:w="120" w:type="dxa"/>
+              <w:bottom w:w="80" w:type="dxa"/>
+              <w:right w:w="120" w:type="dxa"/>
+            </w:tcMar>
+          </w:tcPr>
+          <w:p>
+            <w:r>
+              <w:rPr>
+                <w:sz w:val="20"/>
+                <w:szCs w:val="20"/>
+              </w:rPr>
+              <w:t>Eval Duration</w:t>
+            </w:r>
+          </w:p>
+        </w:tc>
+        <w:tc>
+          <w:tcPr>
+            <w:tcW w:w="2000" w:type="dxa"/>
+            <w:tcBorders>
+              <w:top w:val="single" w:sz="1" w:space="0" w:color="000000"/>
+              <w:left w:val="single" w:sz="1" w:space="0" w:color="000000"/>
+              <w:bottom w:val="single" w:sz="1" w:space="0" w:color="000000"/>
+              <w:right w:val="single" w:sz="1" w:space="0" w:color="000000"/>
+            </w:tcBorders>
+            <w:tcMar>
+              <w:top w:w="80" w:type="dxa"/>
+              <w:left w:w="120" w:type="dxa"/>
+              <w:bottom w:w="80" w:type="dxa"/>
+              <w:right w:w="120" w:type="dxa"/>
+            </w:tcMar>
+          </w:tcPr>
+          <w:p>
+            <w:pPr>
+              <w:spacing w:after="200"/>
+            </w:pPr>
+          </w:p>
+        </w:tc>
+        <w:tc>
+          <w:tcPr>
+            <w:tcW w:w="4160" w:type="dxa"/>
+            <w:tcBorders>
+              <w:top w:val="single" w:sz="1" w:space="0" w:color="000000"/>
+              <w:left w:val="single" w:sz="1" w:space="0" w:color="000000"/>
+              <w:bottom w:val="single" w:sz="1" w:space="0" w:color="000000"/>
+              <w:right w:val="single" w:sz="1" w:space="0" w:color="000000"/>
+            </w:tcBorders>
+            <w:tcMar>
+              <w:top w:w="80" w:type="dxa"/>
+              <w:left w:w="120" w:type="dxa"/>
+              <w:bottom w:w="80" w:type="dxa"/>
+              <w:right w:w="120" w:type="dxa"/>
+            </w:tcMar>
+          </w:tcPr>
+          <w:p>
+            <w:r>
+              <w:rPr>
+                <w:sz w:val="20"/>
+                <w:szCs w:val="20"/>
+              </w:rPr>
+              <w:t>Output generation time</w:t>
+            </w:r>
+          </w:p>
+        </w:tc>
+      </w:tr>
+      <w:tr>
+        <w:tblPrEx>
+          <w:tblCellMar>
+            <w:top w:w="0" w:type="dxa"/>
+            <w:bottom w:w="0" w:type="dxa"/>
+          </w:tblCellMar>
+        </w:tblPrEx>
+        <w:tc>
+          <w:tcPr>
+            <w:tcW w:w="3200" w:type="dxa"/>
+            <w:tcBorders>
+              <w:top w:val="single" w:sz="1" w:space="0" w:color="000000"/>
+              <w:left w:val="single" w:sz="1" w:space="0" w:color="000000"/>
+              <w:bottom w:val="single" w:sz="1" w:space="0" w:color="000000"/>
+              <w:right w:val="single" w:sz="1" w:space="0" w:color="000000"/>
+            </w:tcBorders>
+            <w:tcMar>
+              <w:top w:w="80" w:type="dxa"/>
+              <w:left w:w="120" w:type="dxa"/>
+              <w:bottom w:w="80" w:type="dxa"/>
+              <w:right w:w="120" w:type="dxa"/>
+            </w:tcMar>
+          </w:tcPr>
+          <w:p>
+            <w:r>
+              <w:rPr>
+                <w:sz w:val="20"/>
+                <w:szCs w:val="20"/>
+              </w:rPr>
               <w:t>Eval Rate</w:t>
             </w:r>
           </w:p>
@@ -5094,6 +6671,795 @@
         <w:spacing w:before="300" w:after="100"/>
       </w:pPr>
       <w:r>
+        <w:t>Jetson AGX Orin — Model 3: deepseek-r1:7b</w:t>
+      </w:r>
+    </w:p>
+    <w:tbl>
+      <w:tblPr>
+        <w:tblW w:w="9360" w:type="dxa"/>
+        <w:tblBorders>
+          <w:top w:val="single" w:sz="4" w:space="0" w:color="auto"/>
+          <w:left w:val="single" w:sz="4" w:space="0" w:color="auto"/>
+          <w:bottom w:val="single" w:sz="4" w:space="0" w:color="auto"/>
+          <w:right w:val="single" w:sz="4" w:space="0" w:color="auto"/>
+          <w:insideH w:val="single" w:sz="4" w:space="0" w:color="auto"/>
+          <w:insideV w:val="single" w:sz="4" w:space="0" w:color="auto"/>
+        </w:tblBorders>
+        <w:tblCellMar>
+          <w:left w:w="10" w:type="dxa"/>
+          <w:right w:w="10" w:type="dxa"/>
+        </w:tblCellMar>
+        <w:tblLook w:val="04A0" w:firstRow="1" w:lastRow="0" w:firstColumn="1" w:lastColumn="0" w:noHBand="0" w:noVBand="1"/>
+      </w:tblPr>
+      <w:tblGrid>
+        <w:gridCol w:w="3200"/>
+        <w:gridCol w:w="2000"/>
+        <w:gridCol w:w="4160"/>
+      </w:tblGrid>
+      <w:tr>
+        <w:tblPrEx>
+          <w:tblCellMar>
+            <w:top w:w="0" w:type="dxa"/>
+            <w:bottom w:w="0" w:type="dxa"/>
+          </w:tblCellMar>
+        </w:tblPrEx>
+        <w:tc>
+          <w:tcPr>
+            <w:tcW w:w="3200" w:type="dxa"/>
+            <w:tcBorders>
+              <w:top w:val="single" w:sz="1" w:space="0" w:color="000000"/>
+              <w:left w:val="single" w:sz="1" w:space="0" w:color="000000"/>
+              <w:bottom w:val="single" w:sz="1" w:space="0" w:color="000000"/>
+              <w:right w:val="single" w:sz="1" w:space="0" w:color="000000"/>
+            </w:tcBorders>
+            <w:shd w:val="clear" w:color="auto" w:fill="D5E8F0"/>
+            <w:tcMar>
+              <w:top w:w="80" w:type="dxa"/>
+              <w:left w:w="120" w:type="dxa"/>
+              <w:bottom w:w="80" w:type="dxa"/>
+              <w:right w:w="120" w:type="dxa"/>
+            </w:tcMar>
+          </w:tcPr>
+          <w:p>
+            <w:r>
+              <w:rPr>
+                <w:b/>
+                <w:bCs/>
+                <w:sz w:val="20"/>
+                <w:szCs w:val="20"/>
+              </w:rPr>
+              <w:t>Metric</w:t>
+            </w:r>
+          </w:p>
+        </w:tc>
+        <w:tc>
+          <w:tcPr>
+            <w:tcW w:w="2000" w:type="dxa"/>
+            <w:tcBorders>
+              <w:top w:val="single" w:sz="1" w:space="0" w:color="000000"/>
+              <w:left w:val="single" w:sz="1" w:space="0" w:color="000000"/>
+              <w:bottom w:val="single" w:sz="1" w:space="0" w:color="000000"/>
+              <w:right w:val="single" w:sz="1" w:space="0" w:color="000000"/>
+            </w:tcBorders>
+            <w:shd w:val="clear" w:color="auto" w:fill="D5E8F0"/>
+            <w:tcMar>
+              <w:top w:w="80" w:type="dxa"/>
+              <w:left w:w="120" w:type="dxa"/>
+              <w:bottom w:w="80" w:type="dxa"/>
+              <w:right w:w="120" w:type="dxa"/>
+            </w:tcMar>
+          </w:tcPr>
+          <w:p>
+            <w:r>
+              <w:rPr>
+                <w:b/>
+                <w:bCs/>
+                <w:sz w:val="20"/>
+                <w:szCs w:val="20"/>
+              </w:rPr>
+              <w:t>Value</w:t>
+            </w:r>
+          </w:p>
+        </w:tc>
+        <w:tc>
+          <w:tcPr>
+            <w:tcW w:w="4160" w:type="dxa"/>
+            <w:tcBorders>
+              <w:top w:val="single" w:sz="1" w:space="0" w:color="000000"/>
+              <w:left w:val="single" w:sz="1" w:space="0" w:color="000000"/>
+              <w:bottom w:val="single" w:sz="1" w:space="0" w:color="000000"/>
+              <w:right w:val="single" w:sz="1" w:space="0" w:color="000000"/>
+            </w:tcBorders>
+            <w:shd w:val="clear" w:color="auto" w:fill="D5E8F0"/>
+            <w:tcMar>
+              <w:top w:w="80" w:type="dxa"/>
+              <w:left w:w="120" w:type="dxa"/>
+              <w:bottom w:w="80" w:type="dxa"/>
+              <w:right w:w="120" w:type="dxa"/>
+            </w:tcMar>
+          </w:tcPr>
+          <w:p>
+            <w:r>
+              <w:rPr>
+                <w:b/>
+                <w:bCs/>
+                <w:sz w:val="20"/>
+                <w:szCs w:val="20"/>
+              </w:rPr>
+              <w:t>Description</w:t>
+            </w:r>
+          </w:p>
+        </w:tc>
+      </w:tr>
+      <w:tr>
+        <w:tblPrEx>
+          <w:tblCellMar>
+            <w:top w:w="0" w:type="dxa"/>
+            <w:bottom w:w="0" w:type="dxa"/>
+          </w:tblCellMar>
+        </w:tblPrEx>
+        <w:tc>
+          <w:tcPr>
+            <w:tcW w:w="3200" w:type="dxa"/>
+            <w:tcBorders>
+              <w:top w:val="single" w:sz="1" w:space="0" w:color="000000"/>
+              <w:left w:val="single" w:sz="1" w:space="0" w:color="000000"/>
+              <w:bottom w:val="single" w:sz="1" w:space="0" w:color="000000"/>
+              <w:right w:val="single" w:sz="1" w:space="0" w:color="000000"/>
+            </w:tcBorders>
+            <w:tcMar>
+              <w:top w:w="80" w:type="dxa"/>
+              <w:left w:w="120" w:type="dxa"/>
+              <w:bottom w:w="80" w:type="dxa"/>
+              <w:right w:w="120" w:type="dxa"/>
+            </w:tcMar>
+          </w:tcPr>
+          <w:p>
+            <w:r>
+              <w:rPr>
+                <w:sz w:val="20"/>
+                <w:szCs w:val="20"/>
+              </w:rPr>
+              <w:t>Total Duration</w:t>
+            </w:r>
+          </w:p>
+        </w:tc>
+        <w:tc>
+          <w:tcPr>
+            <w:tcW w:w="2000" w:type="dxa"/>
+            <w:tcBorders>
+              <w:top w:val="single" w:sz="1" w:space="0" w:color="000000"/>
+              <w:left w:val="single" w:sz="1" w:space="0" w:color="000000"/>
+              <w:bottom w:val="single" w:sz="1" w:space="0" w:color="000000"/>
+              <w:right w:val="single" w:sz="1" w:space="0" w:color="000000"/>
+            </w:tcBorders>
+            <w:tcMar>
+              <w:top w:w="80" w:type="dxa"/>
+              <w:left w:w="120" w:type="dxa"/>
+              <w:bottom w:w="80" w:type="dxa"/>
+              <w:right w:w="120" w:type="dxa"/>
+            </w:tcMar>
+          </w:tcPr>
+          <w:p>
+            <w:pPr>
+              <w:spacing w:after="200"/>
+            </w:pPr>
+          </w:p>
+        </w:tc>
+        <w:tc>
+          <w:tcPr>
+            <w:tcW w:w="4160" w:type="dxa"/>
+            <w:tcBorders>
+              <w:top w:val="single" w:sz="1" w:space="0" w:color="000000"/>
+              <w:left w:val="single" w:sz="1" w:space="0" w:color="000000"/>
+              <w:bottom w:val="single" w:sz="1" w:space="0" w:color="000000"/>
+              <w:right w:val="single" w:sz="1" w:space="0" w:color="000000"/>
+            </w:tcBorders>
+            <w:tcMar>
+              <w:top w:w="80" w:type="dxa"/>
+              <w:left w:w="120" w:type="dxa"/>
+              <w:bottom w:w="80" w:type="dxa"/>
+              <w:right w:w="120" w:type="dxa"/>
+            </w:tcMar>
+          </w:tcPr>
+          <w:p>
+            <w:r>
+              <w:rPr>
+                <w:sz w:val="20"/>
+                <w:szCs w:val="20"/>
+              </w:rPr>
+              <w:t>Full execution time</w:t>
+            </w:r>
+          </w:p>
+        </w:tc>
+      </w:tr>
+      <w:tr>
+        <w:tblPrEx>
+          <w:tblCellMar>
+            <w:top w:w="0" w:type="dxa"/>
+            <w:bottom w:w="0" w:type="dxa"/>
+          </w:tblCellMar>
+        </w:tblPrEx>
+        <w:tc>
+          <w:tcPr>
+            <w:tcW w:w="3200" w:type="dxa"/>
+            <w:tcBorders>
+              <w:top w:val="single" w:sz="1" w:space="0" w:color="000000"/>
+              <w:left w:val="single" w:sz="1" w:space="0" w:color="000000"/>
+              <w:bottom w:val="single" w:sz="1" w:space="0" w:color="000000"/>
+              <w:right w:val="single" w:sz="1" w:space="0" w:color="000000"/>
+            </w:tcBorders>
+            <w:tcMar>
+              <w:top w:w="80" w:type="dxa"/>
+              <w:left w:w="120" w:type="dxa"/>
+              <w:bottom w:w="80" w:type="dxa"/>
+              <w:right w:w="120" w:type="dxa"/>
+            </w:tcMar>
+          </w:tcPr>
+          <w:p>
+            <w:r>
+              <w:rPr>
+                <w:sz w:val="20"/>
+                <w:szCs w:val="20"/>
+              </w:rPr>
+              <w:t>Load Duration</w:t>
+            </w:r>
+          </w:p>
+        </w:tc>
+        <w:tc>
+          <w:tcPr>
+            <w:tcW w:w="2000" w:type="dxa"/>
+            <w:tcBorders>
+              <w:top w:val="single" w:sz="1" w:space="0" w:color="000000"/>
+              <w:left w:val="single" w:sz="1" w:space="0" w:color="000000"/>
+              <w:bottom w:val="single" w:sz="1" w:space="0" w:color="000000"/>
+              <w:right w:val="single" w:sz="1" w:space="0" w:color="000000"/>
+            </w:tcBorders>
+            <w:tcMar>
+              <w:top w:w="80" w:type="dxa"/>
+              <w:left w:w="120" w:type="dxa"/>
+              <w:bottom w:w="80" w:type="dxa"/>
+              <w:right w:w="120" w:type="dxa"/>
+            </w:tcMar>
+          </w:tcPr>
+          <w:p>
+            <w:pPr>
+              <w:spacing w:after="200"/>
+            </w:pPr>
+          </w:p>
+        </w:tc>
+        <w:tc>
+          <w:tcPr>
+            <w:tcW w:w="4160" w:type="dxa"/>
+            <w:tcBorders>
+              <w:top w:val="single" w:sz="1" w:space="0" w:color="000000"/>
+              <w:left w:val="single" w:sz="1" w:space="0" w:color="000000"/>
+              <w:bottom w:val="single" w:sz="1" w:space="0" w:color="000000"/>
+              <w:right w:val="single" w:sz="1" w:space="0" w:color="000000"/>
+            </w:tcBorders>
+            <w:tcMar>
+              <w:top w:w="80" w:type="dxa"/>
+              <w:left w:w="120" w:type="dxa"/>
+              <w:bottom w:w="80" w:type="dxa"/>
+              <w:right w:w="120" w:type="dxa"/>
+            </w:tcMar>
+          </w:tcPr>
+          <w:p>
+            <w:r>
+              <w:rPr>
+                <w:sz w:val="20"/>
+                <w:szCs w:val="20"/>
+              </w:rPr>
+              <w:t>Model loading time</w:t>
+            </w:r>
+          </w:p>
+        </w:tc>
+      </w:tr>
+      <w:tr>
+        <w:tblPrEx>
+          <w:tblCellMar>
+            <w:top w:w="0" w:type="dxa"/>
+            <w:bottom w:w="0" w:type="dxa"/>
+          </w:tblCellMar>
+        </w:tblPrEx>
+        <w:tc>
+          <w:tcPr>
+            <w:tcW w:w="3200" w:type="dxa"/>
+            <w:tcBorders>
+              <w:top w:val="single" w:sz="1" w:space="0" w:color="000000"/>
+              <w:left w:val="single" w:sz="1" w:space="0" w:color="000000"/>
+              <w:bottom w:val="single" w:sz="1" w:space="0" w:color="000000"/>
+              <w:right w:val="single" w:sz="1" w:space="0" w:color="000000"/>
+            </w:tcBorders>
+            <w:tcMar>
+              <w:top w:w="80" w:type="dxa"/>
+              <w:left w:w="120" w:type="dxa"/>
+              <w:bottom w:w="80" w:type="dxa"/>
+              <w:right w:w="120" w:type="dxa"/>
+            </w:tcMar>
+          </w:tcPr>
+          <w:p>
+            <w:r>
+              <w:rPr>
+                <w:sz w:val="20"/>
+                <w:szCs w:val="20"/>
+              </w:rPr>
+              <w:t>Prompt Eval Count</w:t>
+            </w:r>
+          </w:p>
+        </w:tc>
+        <w:tc>
+          <w:tcPr>
+            <w:tcW w:w="2000" w:type="dxa"/>
+            <w:tcBorders>
+              <w:top w:val="single" w:sz="1" w:space="0" w:color="000000"/>
+              <w:left w:val="single" w:sz="1" w:space="0" w:color="000000"/>
+              <w:bottom w:val="single" w:sz="1" w:space="0" w:color="000000"/>
+              <w:right w:val="single" w:sz="1" w:space="0" w:color="000000"/>
+            </w:tcBorders>
+            <w:tcMar>
+              <w:top w:w="80" w:type="dxa"/>
+              <w:left w:w="120" w:type="dxa"/>
+              <w:bottom w:w="80" w:type="dxa"/>
+              <w:right w:w="120" w:type="dxa"/>
+            </w:tcMar>
+          </w:tcPr>
+          <w:p>
+            <w:pPr>
+              <w:spacing w:after="200"/>
+            </w:pPr>
+          </w:p>
+        </w:tc>
+        <w:tc>
+          <w:tcPr>
+            <w:tcW w:w="4160" w:type="dxa"/>
+            <w:tcBorders>
+              <w:top w:val="single" w:sz="1" w:space="0" w:color="000000"/>
+              <w:left w:val="single" w:sz="1" w:space="0" w:color="000000"/>
+              <w:bottom w:val="single" w:sz="1" w:space="0" w:color="000000"/>
+              <w:right w:val="single" w:sz="1" w:space="0" w:color="000000"/>
+            </w:tcBorders>
+            <w:tcMar>
+              <w:top w:w="80" w:type="dxa"/>
+              <w:left w:w="120" w:type="dxa"/>
+              <w:bottom w:w="80" w:type="dxa"/>
+              <w:right w:w="120" w:type="dxa"/>
+            </w:tcMar>
+          </w:tcPr>
+          <w:p>
+            <w:r>
+              <w:rPr>
+                <w:sz w:val="20"/>
+                <w:szCs w:val="20"/>
+              </w:rPr>
+              <w:t>Number of input tokens</w:t>
+            </w:r>
+          </w:p>
+        </w:tc>
+      </w:tr>
+      <w:tr>
+        <w:tblPrEx>
+          <w:tblCellMar>
+            <w:top w:w="0" w:type="dxa"/>
+            <w:bottom w:w="0" w:type="dxa"/>
+          </w:tblCellMar>
+        </w:tblPrEx>
+        <w:tc>
+          <w:tcPr>
+            <w:tcW w:w="3200" w:type="dxa"/>
+            <w:tcBorders>
+              <w:top w:val="single" w:sz="1" w:space="0" w:color="000000"/>
+              <w:left w:val="single" w:sz="1" w:space="0" w:color="000000"/>
+              <w:bottom w:val="single" w:sz="1" w:space="0" w:color="000000"/>
+              <w:right w:val="single" w:sz="1" w:space="0" w:color="000000"/>
+            </w:tcBorders>
+            <w:tcMar>
+              <w:top w:w="80" w:type="dxa"/>
+              <w:left w:w="120" w:type="dxa"/>
+              <w:bottom w:w="80" w:type="dxa"/>
+              <w:right w:w="120" w:type="dxa"/>
+            </w:tcMar>
+          </w:tcPr>
+          <w:p>
+            <w:r>
+              <w:rPr>
+                <w:sz w:val="20"/>
+                <w:szCs w:val="20"/>
+              </w:rPr>
+              <w:t>Prompt Eval Duration</w:t>
+            </w:r>
+          </w:p>
+        </w:tc>
+        <w:tc>
+          <w:tcPr>
+            <w:tcW w:w="2000" w:type="dxa"/>
+            <w:tcBorders>
+              <w:top w:val="single" w:sz="1" w:space="0" w:color="000000"/>
+              <w:left w:val="single" w:sz="1" w:space="0" w:color="000000"/>
+              <w:bottom w:val="single" w:sz="1" w:space="0" w:color="000000"/>
+              <w:right w:val="single" w:sz="1" w:space="0" w:color="000000"/>
+            </w:tcBorders>
+            <w:tcMar>
+              <w:top w:w="80" w:type="dxa"/>
+              <w:left w:w="120" w:type="dxa"/>
+              <w:bottom w:w="80" w:type="dxa"/>
+              <w:right w:w="120" w:type="dxa"/>
+            </w:tcMar>
+          </w:tcPr>
+          <w:p>
+            <w:pPr>
+              <w:spacing w:after="200"/>
+            </w:pPr>
+          </w:p>
+        </w:tc>
+        <w:tc>
+          <w:tcPr>
+            <w:tcW w:w="4160" w:type="dxa"/>
+            <w:tcBorders>
+              <w:top w:val="single" w:sz="1" w:space="0" w:color="000000"/>
+              <w:left w:val="single" w:sz="1" w:space="0" w:color="000000"/>
+              <w:bottom w:val="single" w:sz="1" w:space="0" w:color="000000"/>
+              <w:right w:val="single" w:sz="1" w:space="0" w:color="000000"/>
+            </w:tcBorders>
+            <w:tcMar>
+              <w:top w:w="80" w:type="dxa"/>
+              <w:left w:w="120" w:type="dxa"/>
+              <w:bottom w:w="80" w:type="dxa"/>
+              <w:right w:w="120" w:type="dxa"/>
+            </w:tcMar>
+          </w:tcPr>
+          <w:p>
+            <w:r>
+              <w:rPr>
+                <w:sz w:val="20"/>
+                <w:szCs w:val="20"/>
+              </w:rPr>
+              <w:t>Input processing time</w:t>
+            </w:r>
+          </w:p>
+        </w:tc>
+      </w:tr>
+      <w:tr>
+        <w:tblPrEx>
+          <w:tblCellMar>
+            <w:top w:w="0" w:type="dxa"/>
+            <w:bottom w:w="0" w:type="dxa"/>
+          </w:tblCellMar>
+        </w:tblPrEx>
+        <w:tc>
+          <w:tcPr>
+            <w:tcW w:w="3200" w:type="dxa"/>
+            <w:tcBorders>
+              <w:top w:val="single" w:sz="1" w:space="0" w:color="000000"/>
+              <w:left w:val="single" w:sz="1" w:space="0" w:color="000000"/>
+              <w:bottom w:val="single" w:sz="1" w:space="0" w:color="000000"/>
+              <w:right w:val="single" w:sz="1" w:space="0" w:color="000000"/>
+            </w:tcBorders>
+            <w:tcMar>
+              <w:top w:w="80" w:type="dxa"/>
+              <w:left w:w="120" w:type="dxa"/>
+              <w:bottom w:w="80" w:type="dxa"/>
+              <w:right w:w="120" w:type="dxa"/>
+            </w:tcMar>
+          </w:tcPr>
+          <w:p>
+            <w:r>
+              <w:rPr>
+                <w:sz w:val="20"/>
+                <w:szCs w:val="20"/>
+              </w:rPr>
+              <w:t>Prompt Eval Rate</w:t>
+            </w:r>
+          </w:p>
+        </w:tc>
+        <w:tc>
+          <w:tcPr>
+            <w:tcW w:w="2000" w:type="dxa"/>
+            <w:tcBorders>
+              <w:top w:val="single" w:sz="1" w:space="0" w:color="000000"/>
+              <w:left w:val="single" w:sz="1" w:space="0" w:color="000000"/>
+              <w:bottom w:val="single" w:sz="1" w:space="0" w:color="000000"/>
+              <w:right w:val="single" w:sz="1" w:space="0" w:color="000000"/>
+            </w:tcBorders>
+            <w:tcMar>
+              <w:top w:w="80" w:type="dxa"/>
+              <w:left w:w="120" w:type="dxa"/>
+              <w:bottom w:w="80" w:type="dxa"/>
+              <w:right w:w="120" w:type="dxa"/>
+            </w:tcMar>
+          </w:tcPr>
+          <w:p>
+            <w:pPr>
+              <w:spacing w:after="200"/>
+            </w:pPr>
+          </w:p>
+        </w:tc>
+        <w:tc>
+          <w:tcPr>
+            <w:tcW w:w="4160" w:type="dxa"/>
+            <w:tcBorders>
+              <w:top w:val="single" w:sz="1" w:space="0" w:color="000000"/>
+              <w:left w:val="single" w:sz="1" w:space="0" w:color="000000"/>
+              <w:bottom w:val="single" w:sz="1" w:space="0" w:color="000000"/>
+              <w:right w:val="single" w:sz="1" w:space="0" w:color="000000"/>
+            </w:tcBorders>
+            <w:tcMar>
+              <w:top w:w="80" w:type="dxa"/>
+              <w:left w:w="120" w:type="dxa"/>
+              <w:bottom w:w="80" w:type="dxa"/>
+              <w:right w:w="120" w:type="dxa"/>
+            </w:tcMar>
+          </w:tcPr>
+          <w:p>
+            <w:r>
+              <w:rPr>
+                <w:sz w:val="20"/>
+                <w:szCs w:val="20"/>
+              </w:rPr>
+              <w:t>Input processing speed (tokens/s)</w:t>
+            </w:r>
+          </w:p>
+        </w:tc>
+      </w:tr>
+      <w:tr>
+        <w:tblPrEx>
+          <w:tblCellMar>
+            <w:top w:w="0" w:type="dxa"/>
+            <w:bottom w:w="0" w:type="dxa"/>
+          </w:tblCellMar>
+        </w:tblPrEx>
+        <w:tc>
+          <w:tcPr>
+            <w:tcW w:w="3200" w:type="dxa"/>
+            <w:tcBorders>
+              <w:top w:val="single" w:sz="1" w:space="0" w:color="000000"/>
+              <w:left w:val="single" w:sz="1" w:space="0" w:color="000000"/>
+              <w:bottom w:val="single" w:sz="1" w:space="0" w:color="000000"/>
+              <w:right w:val="single" w:sz="1" w:space="0" w:color="000000"/>
+            </w:tcBorders>
+            <w:tcMar>
+              <w:top w:w="80" w:type="dxa"/>
+              <w:left w:w="120" w:type="dxa"/>
+              <w:bottom w:w="80" w:type="dxa"/>
+              <w:right w:w="120" w:type="dxa"/>
+            </w:tcMar>
+          </w:tcPr>
+          <w:p>
+            <w:r>
+              <w:rPr>
+                <w:sz w:val="20"/>
+                <w:szCs w:val="20"/>
+              </w:rPr>
+              <w:t>Eval Count</w:t>
+            </w:r>
+          </w:p>
+        </w:tc>
+        <w:tc>
+          <w:tcPr>
+            <w:tcW w:w="2000" w:type="dxa"/>
+            <w:tcBorders>
+              <w:top w:val="single" w:sz="1" w:space="0" w:color="000000"/>
+              <w:left w:val="single" w:sz="1" w:space="0" w:color="000000"/>
+              <w:bottom w:val="single" w:sz="1" w:space="0" w:color="000000"/>
+              <w:right w:val="single" w:sz="1" w:space="0" w:color="000000"/>
+            </w:tcBorders>
+            <w:tcMar>
+              <w:top w:w="80" w:type="dxa"/>
+              <w:left w:w="120" w:type="dxa"/>
+              <w:bottom w:w="80" w:type="dxa"/>
+              <w:right w:w="120" w:type="dxa"/>
+            </w:tcMar>
+          </w:tcPr>
+          <w:p>
+            <w:pPr>
+              <w:spacing w:after="200"/>
+            </w:pPr>
+          </w:p>
+        </w:tc>
+        <w:tc>
+          <w:tcPr>
+            <w:tcW w:w="4160" w:type="dxa"/>
+            <w:tcBorders>
+              <w:top w:val="single" w:sz="1" w:space="0" w:color="000000"/>
+              <w:left w:val="single" w:sz="1" w:space="0" w:color="000000"/>
+              <w:bottom w:val="single" w:sz="1" w:space="0" w:color="000000"/>
+              <w:right w:val="single" w:sz="1" w:space="0" w:color="000000"/>
+            </w:tcBorders>
+            <w:tcMar>
+              <w:top w:w="80" w:type="dxa"/>
+              <w:left w:w="120" w:type="dxa"/>
+              <w:bottom w:w="80" w:type="dxa"/>
+              <w:right w:w="120" w:type="dxa"/>
+            </w:tcMar>
+          </w:tcPr>
+          <w:p>
+            <w:r>
+              <w:rPr>
+                <w:sz w:val="20"/>
+                <w:szCs w:val="20"/>
+              </w:rPr>
+              <w:t>Number of output tokens</w:t>
+            </w:r>
+          </w:p>
+        </w:tc>
+      </w:tr>
+      <w:tr>
+        <w:tblPrEx>
+          <w:tblCellMar>
+            <w:top w:w="0" w:type="dxa"/>
+            <w:bottom w:w="0" w:type="dxa"/>
+          </w:tblCellMar>
+        </w:tblPrEx>
+        <w:tc>
+          <w:tcPr>
+            <w:tcW w:w="3200" w:type="dxa"/>
+            <w:tcBorders>
+              <w:top w:val="single" w:sz="1" w:space="0" w:color="000000"/>
+              <w:left w:val="single" w:sz="1" w:space="0" w:color="000000"/>
+              <w:bottom w:val="single" w:sz="1" w:space="0" w:color="000000"/>
+              <w:right w:val="single" w:sz="1" w:space="0" w:color="000000"/>
+            </w:tcBorders>
+            <w:tcMar>
+              <w:top w:w="80" w:type="dxa"/>
+              <w:left w:w="120" w:type="dxa"/>
+              <w:bottom w:w="80" w:type="dxa"/>
+              <w:right w:w="120" w:type="dxa"/>
+            </w:tcMar>
+          </w:tcPr>
+          <w:p>
+            <w:r>
+              <w:rPr>
+                <w:sz w:val="20"/>
+                <w:szCs w:val="20"/>
+              </w:rPr>
+              <w:t>Eval Duration</w:t>
+            </w:r>
+          </w:p>
+        </w:tc>
+        <w:tc>
+          <w:tcPr>
+            <w:tcW w:w="2000" w:type="dxa"/>
+            <w:tcBorders>
+              <w:top w:val="single" w:sz="1" w:space="0" w:color="000000"/>
+              <w:left w:val="single" w:sz="1" w:space="0" w:color="000000"/>
+              <w:bottom w:val="single" w:sz="1" w:space="0" w:color="000000"/>
+              <w:right w:val="single" w:sz="1" w:space="0" w:color="000000"/>
+            </w:tcBorders>
+            <w:tcMar>
+              <w:top w:w="80" w:type="dxa"/>
+              <w:left w:w="120" w:type="dxa"/>
+              <w:bottom w:w="80" w:type="dxa"/>
+              <w:right w:w="120" w:type="dxa"/>
+            </w:tcMar>
+          </w:tcPr>
+          <w:p>
+            <w:pPr>
+              <w:spacing w:after="200"/>
+            </w:pPr>
+          </w:p>
+        </w:tc>
+        <w:tc>
+          <w:tcPr>
+            <w:tcW w:w="4160" w:type="dxa"/>
+            <w:tcBorders>
+              <w:top w:val="single" w:sz="1" w:space="0" w:color="000000"/>
+              <w:left w:val="single" w:sz="1" w:space="0" w:color="000000"/>
+              <w:bottom w:val="single" w:sz="1" w:space="0" w:color="000000"/>
+              <w:right w:val="single" w:sz="1" w:space="0" w:color="000000"/>
+            </w:tcBorders>
+            <w:tcMar>
+              <w:top w:w="80" w:type="dxa"/>
+              <w:left w:w="120" w:type="dxa"/>
+              <w:bottom w:w="80" w:type="dxa"/>
+              <w:right w:w="120" w:type="dxa"/>
+            </w:tcMar>
+          </w:tcPr>
+          <w:p>
+            <w:r>
+              <w:rPr>
+                <w:sz w:val="20"/>
+                <w:szCs w:val="20"/>
+              </w:rPr>
+              <w:t>Output generation time</w:t>
+            </w:r>
+          </w:p>
+        </w:tc>
+      </w:tr>
+      <w:tr>
+        <w:tblPrEx>
+          <w:tblCellMar>
+            <w:top w:w="0" w:type="dxa"/>
+            <w:bottom w:w="0" w:type="dxa"/>
+          </w:tblCellMar>
+        </w:tblPrEx>
+        <w:tc>
+          <w:tcPr>
+            <w:tcW w:w="3200" w:type="dxa"/>
+            <w:tcBorders>
+              <w:top w:val="single" w:sz="1" w:space="0" w:color="000000"/>
+              <w:left w:val="single" w:sz="1" w:space="0" w:color="000000"/>
+              <w:bottom w:val="single" w:sz="1" w:space="0" w:color="000000"/>
+              <w:right w:val="single" w:sz="1" w:space="0" w:color="000000"/>
+            </w:tcBorders>
+            <w:tcMar>
+              <w:top w:w="80" w:type="dxa"/>
+              <w:left w:w="120" w:type="dxa"/>
+              <w:bottom w:w="80" w:type="dxa"/>
+              <w:right w:w="120" w:type="dxa"/>
+            </w:tcMar>
+          </w:tcPr>
+          <w:p>
+            <w:r>
+              <w:rPr>
+                <w:sz w:val="20"/>
+                <w:szCs w:val="20"/>
+              </w:rPr>
+              <w:lastRenderedPageBreak/>
+              <w:t>Eval Rate</w:t>
+            </w:r>
+          </w:p>
+        </w:tc>
+        <w:tc>
+          <w:tcPr>
+            <w:tcW w:w="2000" w:type="dxa"/>
+            <w:tcBorders>
+              <w:top w:val="single" w:sz="1" w:space="0" w:color="000000"/>
+              <w:left w:val="single" w:sz="1" w:space="0" w:color="000000"/>
+              <w:bottom w:val="single" w:sz="1" w:space="0" w:color="000000"/>
+              <w:right w:val="single" w:sz="1" w:space="0" w:color="000000"/>
+            </w:tcBorders>
+            <w:tcMar>
+              <w:top w:w="80" w:type="dxa"/>
+              <w:left w:w="120" w:type="dxa"/>
+              <w:bottom w:w="80" w:type="dxa"/>
+              <w:right w:w="120" w:type="dxa"/>
+            </w:tcMar>
+          </w:tcPr>
+          <w:p>
+            <w:pPr>
+              <w:spacing w:after="200"/>
+            </w:pPr>
+          </w:p>
+        </w:tc>
+        <w:tc>
+          <w:tcPr>
+            <w:tcW w:w="4160" w:type="dxa"/>
+            <w:tcBorders>
+              <w:top w:val="single" w:sz="1" w:space="0" w:color="000000"/>
+              <w:left w:val="single" w:sz="1" w:space="0" w:color="000000"/>
+              <w:bottom w:val="single" w:sz="1" w:space="0" w:color="000000"/>
+              <w:right w:val="single" w:sz="1" w:space="0" w:color="000000"/>
+            </w:tcBorders>
+            <w:tcMar>
+              <w:top w:w="80" w:type="dxa"/>
+              <w:left w:w="120" w:type="dxa"/>
+              <w:bottom w:w="80" w:type="dxa"/>
+              <w:right w:w="120" w:type="dxa"/>
+            </w:tcMar>
+          </w:tcPr>
+          <w:p>
+            <w:r>
+              <w:rPr>
+                <w:sz w:val="20"/>
+                <w:szCs w:val="20"/>
+              </w:rPr>
+              <w:t>Output generation speed (tokens/s)</w:t>
+            </w:r>
+          </w:p>
+        </w:tc>
+      </w:tr>
+    </w:tbl>
+    <w:p>
+      <w:pPr>
+        <w:spacing w:before="100" w:after="100"/>
+      </w:pPr>
+    </w:p>
+    <w:p>
+      <w:pPr>
+        <w:pStyle w:val="Heading2"/>
+        <w:spacing w:before="300" w:after="100"/>
+      </w:pPr>
+      <w:r>
         <w:t>A100 — Model 1: llama3.2:1b</w:t>
       </w:r>
     </w:p>
@@ -5817,7 +8183,6 @@
                 <w:sz w:val="20"/>
                 <w:szCs w:val="20"/>
               </w:rPr>
-              <w:lastRenderedPageBreak/>
               <w:t>Eval Rate</w:t>
             </w:r>
           </w:p>
@@ -5884,6 +8249,795 @@
       </w:pPr>
       <w:r>
         <w:t>A100 — Model 2: deepseek-r1:1.5b</w:t>
+      </w:r>
+    </w:p>
+    <w:tbl>
+      <w:tblPr>
+        <w:tblW w:w="9360" w:type="dxa"/>
+        <w:tblBorders>
+          <w:top w:val="single" w:sz="4" w:space="0" w:color="auto"/>
+          <w:left w:val="single" w:sz="4" w:space="0" w:color="auto"/>
+          <w:bottom w:val="single" w:sz="4" w:space="0" w:color="auto"/>
+          <w:right w:val="single" w:sz="4" w:space="0" w:color="auto"/>
+          <w:insideH w:val="single" w:sz="4" w:space="0" w:color="auto"/>
+          <w:insideV w:val="single" w:sz="4" w:space="0" w:color="auto"/>
+        </w:tblBorders>
+        <w:tblCellMar>
+          <w:left w:w="10" w:type="dxa"/>
+          <w:right w:w="10" w:type="dxa"/>
+        </w:tblCellMar>
+        <w:tblLook w:val="04A0" w:firstRow="1" w:lastRow="0" w:firstColumn="1" w:lastColumn="0" w:noHBand="0" w:noVBand="1"/>
+      </w:tblPr>
+      <w:tblGrid>
+        <w:gridCol w:w="3200"/>
+        <w:gridCol w:w="2000"/>
+        <w:gridCol w:w="4160"/>
+      </w:tblGrid>
+      <w:tr>
+        <w:tblPrEx>
+          <w:tblCellMar>
+            <w:top w:w="0" w:type="dxa"/>
+            <w:bottom w:w="0" w:type="dxa"/>
+          </w:tblCellMar>
+        </w:tblPrEx>
+        <w:tc>
+          <w:tcPr>
+            <w:tcW w:w="3200" w:type="dxa"/>
+            <w:tcBorders>
+              <w:top w:val="single" w:sz="1" w:space="0" w:color="000000"/>
+              <w:left w:val="single" w:sz="1" w:space="0" w:color="000000"/>
+              <w:bottom w:val="single" w:sz="1" w:space="0" w:color="000000"/>
+              <w:right w:val="single" w:sz="1" w:space="0" w:color="000000"/>
+            </w:tcBorders>
+            <w:shd w:val="clear" w:color="auto" w:fill="D5E8F0"/>
+            <w:tcMar>
+              <w:top w:w="80" w:type="dxa"/>
+              <w:left w:w="120" w:type="dxa"/>
+              <w:bottom w:w="80" w:type="dxa"/>
+              <w:right w:w="120" w:type="dxa"/>
+            </w:tcMar>
+          </w:tcPr>
+          <w:p>
+            <w:r>
+              <w:rPr>
+                <w:b/>
+                <w:bCs/>
+                <w:sz w:val="20"/>
+                <w:szCs w:val="20"/>
+              </w:rPr>
+              <w:t>Metric</w:t>
+            </w:r>
+          </w:p>
+        </w:tc>
+        <w:tc>
+          <w:tcPr>
+            <w:tcW w:w="2000" w:type="dxa"/>
+            <w:tcBorders>
+              <w:top w:val="single" w:sz="1" w:space="0" w:color="000000"/>
+              <w:left w:val="single" w:sz="1" w:space="0" w:color="000000"/>
+              <w:bottom w:val="single" w:sz="1" w:space="0" w:color="000000"/>
+              <w:right w:val="single" w:sz="1" w:space="0" w:color="000000"/>
+            </w:tcBorders>
+            <w:shd w:val="clear" w:color="auto" w:fill="D5E8F0"/>
+            <w:tcMar>
+              <w:top w:w="80" w:type="dxa"/>
+              <w:left w:w="120" w:type="dxa"/>
+              <w:bottom w:w="80" w:type="dxa"/>
+              <w:right w:w="120" w:type="dxa"/>
+            </w:tcMar>
+          </w:tcPr>
+          <w:p>
+            <w:r>
+              <w:rPr>
+                <w:b/>
+                <w:bCs/>
+                <w:sz w:val="20"/>
+                <w:szCs w:val="20"/>
+              </w:rPr>
+              <w:t>Value</w:t>
+            </w:r>
+          </w:p>
+        </w:tc>
+        <w:tc>
+          <w:tcPr>
+            <w:tcW w:w="4160" w:type="dxa"/>
+            <w:tcBorders>
+              <w:top w:val="single" w:sz="1" w:space="0" w:color="000000"/>
+              <w:left w:val="single" w:sz="1" w:space="0" w:color="000000"/>
+              <w:bottom w:val="single" w:sz="1" w:space="0" w:color="000000"/>
+              <w:right w:val="single" w:sz="1" w:space="0" w:color="000000"/>
+            </w:tcBorders>
+            <w:shd w:val="clear" w:color="auto" w:fill="D5E8F0"/>
+            <w:tcMar>
+              <w:top w:w="80" w:type="dxa"/>
+              <w:left w:w="120" w:type="dxa"/>
+              <w:bottom w:w="80" w:type="dxa"/>
+              <w:right w:w="120" w:type="dxa"/>
+            </w:tcMar>
+          </w:tcPr>
+          <w:p>
+            <w:r>
+              <w:rPr>
+                <w:b/>
+                <w:bCs/>
+                <w:sz w:val="20"/>
+                <w:szCs w:val="20"/>
+              </w:rPr>
+              <w:t>Description</w:t>
+            </w:r>
+          </w:p>
+        </w:tc>
+      </w:tr>
+      <w:tr>
+        <w:tblPrEx>
+          <w:tblCellMar>
+            <w:top w:w="0" w:type="dxa"/>
+            <w:bottom w:w="0" w:type="dxa"/>
+          </w:tblCellMar>
+        </w:tblPrEx>
+        <w:tc>
+          <w:tcPr>
+            <w:tcW w:w="3200" w:type="dxa"/>
+            <w:tcBorders>
+              <w:top w:val="single" w:sz="1" w:space="0" w:color="000000"/>
+              <w:left w:val="single" w:sz="1" w:space="0" w:color="000000"/>
+              <w:bottom w:val="single" w:sz="1" w:space="0" w:color="000000"/>
+              <w:right w:val="single" w:sz="1" w:space="0" w:color="000000"/>
+            </w:tcBorders>
+            <w:tcMar>
+              <w:top w:w="80" w:type="dxa"/>
+              <w:left w:w="120" w:type="dxa"/>
+              <w:bottom w:w="80" w:type="dxa"/>
+              <w:right w:w="120" w:type="dxa"/>
+            </w:tcMar>
+          </w:tcPr>
+          <w:p>
+            <w:r>
+              <w:rPr>
+                <w:sz w:val="20"/>
+                <w:szCs w:val="20"/>
+              </w:rPr>
+              <w:t>Total Duration</w:t>
+            </w:r>
+          </w:p>
+        </w:tc>
+        <w:tc>
+          <w:tcPr>
+            <w:tcW w:w="2000" w:type="dxa"/>
+            <w:tcBorders>
+              <w:top w:val="single" w:sz="1" w:space="0" w:color="000000"/>
+              <w:left w:val="single" w:sz="1" w:space="0" w:color="000000"/>
+              <w:bottom w:val="single" w:sz="1" w:space="0" w:color="000000"/>
+              <w:right w:val="single" w:sz="1" w:space="0" w:color="000000"/>
+            </w:tcBorders>
+            <w:tcMar>
+              <w:top w:w="80" w:type="dxa"/>
+              <w:left w:w="120" w:type="dxa"/>
+              <w:bottom w:w="80" w:type="dxa"/>
+              <w:right w:w="120" w:type="dxa"/>
+            </w:tcMar>
+          </w:tcPr>
+          <w:p>
+            <w:pPr>
+              <w:spacing w:after="200"/>
+            </w:pPr>
+          </w:p>
+        </w:tc>
+        <w:tc>
+          <w:tcPr>
+            <w:tcW w:w="4160" w:type="dxa"/>
+            <w:tcBorders>
+              <w:top w:val="single" w:sz="1" w:space="0" w:color="000000"/>
+              <w:left w:val="single" w:sz="1" w:space="0" w:color="000000"/>
+              <w:bottom w:val="single" w:sz="1" w:space="0" w:color="000000"/>
+              <w:right w:val="single" w:sz="1" w:space="0" w:color="000000"/>
+            </w:tcBorders>
+            <w:tcMar>
+              <w:top w:w="80" w:type="dxa"/>
+              <w:left w:w="120" w:type="dxa"/>
+              <w:bottom w:w="80" w:type="dxa"/>
+              <w:right w:w="120" w:type="dxa"/>
+            </w:tcMar>
+          </w:tcPr>
+          <w:p>
+            <w:r>
+              <w:rPr>
+                <w:sz w:val="20"/>
+                <w:szCs w:val="20"/>
+              </w:rPr>
+              <w:t>Full execution time</w:t>
+            </w:r>
+          </w:p>
+        </w:tc>
+      </w:tr>
+      <w:tr>
+        <w:tblPrEx>
+          <w:tblCellMar>
+            <w:top w:w="0" w:type="dxa"/>
+            <w:bottom w:w="0" w:type="dxa"/>
+          </w:tblCellMar>
+        </w:tblPrEx>
+        <w:tc>
+          <w:tcPr>
+            <w:tcW w:w="3200" w:type="dxa"/>
+            <w:tcBorders>
+              <w:top w:val="single" w:sz="1" w:space="0" w:color="000000"/>
+              <w:left w:val="single" w:sz="1" w:space="0" w:color="000000"/>
+              <w:bottom w:val="single" w:sz="1" w:space="0" w:color="000000"/>
+              <w:right w:val="single" w:sz="1" w:space="0" w:color="000000"/>
+            </w:tcBorders>
+            <w:tcMar>
+              <w:top w:w="80" w:type="dxa"/>
+              <w:left w:w="120" w:type="dxa"/>
+              <w:bottom w:w="80" w:type="dxa"/>
+              <w:right w:w="120" w:type="dxa"/>
+            </w:tcMar>
+          </w:tcPr>
+          <w:p>
+            <w:r>
+              <w:rPr>
+                <w:sz w:val="20"/>
+                <w:szCs w:val="20"/>
+              </w:rPr>
+              <w:t>Load Duration</w:t>
+            </w:r>
+          </w:p>
+        </w:tc>
+        <w:tc>
+          <w:tcPr>
+            <w:tcW w:w="2000" w:type="dxa"/>
+            <w:tcBorders>
+              <w:top w:val="single" w:sz="1" w:space="0" w:color="000000"/>
+              <w:left w:val="single" w:sz="1" w:space="0" w:color="000000"/>
+              <w:bottom w:val="single" w:sz="1" w:space="0" w:color="000000"/>
+              <w:right w:val="single" w:sz="1" w:space="0" w:color="000000"/>
+            </w:tcBorders>
+            <w:tcMar>
+              <w:top w:w="80" w:type="dxa"/>
+              <w:left w:w="120" w:type="dxa"/>
+              <w:bottom w:w="80" w:type="dxa"/>
+              <w:right w:w="120" w:type="dxa"/>
+            </w:tcMar>
+          </w:tcPr>
+          <w:p>
+            <w:pPr>
+              <w:spacing w:after="200"/>
+            </w:pPr>
+          </w:p>
+        </w:tc>
+        <w:tc>
+          <w:tcPr>
+            <w:tcW w:w="4160" w:type="dxa"/>
+            <w:tcBorders>
+              <w:top w:val="single" w:sz="1" w:space="0" w:color="000000"/>
+              <w:left w:val="single" w:sz="1" w:space="0" w:color="000000"/>
+              <w:bottom w:val="single" w:sz="1" w:space="0" w:color="000000"/>
+              <w:right w:val="single" w:sz="1" w:space="0" w:color="000000"/>
+            </w:tcBorders>
+            <w:tcMar>
+              <w:top w:w="80" w:type="dxa"/>
+              <w:left w:w="120" w:type="dxa"/>
+              <w:bottom w:w="80" w:type="dxa"/>
+              <w:right w:w="120" w:type="dxa"/>
+            </w:tcMar>
+          </w:tcPr>
+          <w:p>
+            <w:r>
+              <w:rPr>
+                <w:sz w:val="20"/>
+                <w:szCs w:val="20"/>
+              </w:rPr>
+              <w:t>Model loading time</w:t>
+            </w:r>
+          </w:p>
+        </w:tc>
+      </w:tr>
+      <w:tr>
+        <w:tblPrEx>
+          <w:tblCellMar>
+            <w:top w:w="0" w:type="dxa"/>
+            <w:bottom w:w="0" w:type="dxa"/>
+          </w:tblCellMar>
+        </w:tblPrEx>
+        <w:tc>
+          <w:tcPr>
+            <w:tcW w:w="3200" w:type="dxa"/>
+            <w:tcBorders>
+              <w:top w:val="single" w:sz="1" w:space="0" w:color="000000"/>
+              <w:left w:val="single" w:sz="1" w:space="0" w:color="000000"/>
+              <w:bottom w:val="single" w:sz="1" w:space="0" w:color="000000"/>
+              <w:right w:val="single" w:sz="1" w:space="0" w:color="000000"/>
+            </w:tcBorders>
+            <w:tcMar>
+              <w:top w:w="80" w:type="dxa"/>
+              <w:left w:w="120" w:type="dxa"/>
+              <w:bottom w:w="80" w:type="dxa"/>
+              <w:right w:w="120" w:type="dxa"/>
+            </w:tcMar>
+          </w:tcPr>
+          <w:p>
+            <w:r>
+              <w:rPr>
+                <w:sz w:val="20"/>
+                <w:szCs w:val="20"/>
+              </w:rPr>
+              <w:t>Prompt Eval Count</w:t>
+            </w:r>
+          </w:p>
+        </w:tc>
+        <w:tc>
+          <w:tcPr>
+            <w:tcW w:w="2000" w:type="dxa"/>
+            <w:tcBorders>
+              <w:top w:val="single" w:sz="1" w:space="0" w:color="000000"/>
+              <w:left w:val="single" w:sz="1" w:space="0" w:color="000000"/>
+              <w:bottom w:val="single" w:sz="1" w:space="0" w:color="000000"/>
+              <w:right w:val="single" w:sz="1" w:space="0" w:color="000000"/>
+            </w:tcBorders>
+            <w:tcMar>
+              <w:top w:w="80" w:type="dxa"/>
+              <w:left w:w="120" w:type="dxa"/>
+              <w:bottom w:w="80" w:type="dxa"/>
+              <w:right w:w="120" w:type="dxa"/>
+            </w:tcMar>
+          </w:tcPr>
+          <w:p>
+            <w:pPr>
+              <w:spacing w:after="200"/>
+            </w:pPr>
+          </w:p>
+        </w:tc>
+        <w:tc>
+          <w:tcPr>
+            <w:tcW w:w="4160" w:type="dxa"/>
+            <w:tcBorders>
+              <w:top w:val="single" w:sz="1" w:space="0" w:color="000000"/>
+              <w:left w:val="single" w:sz="1" w:space="0" w:color="000000"/>
+              <w:bottom w:val="single" w:sz="1" w:space="0" w:color="000000"/>
+              <w:right w:val="single" w:sz="1" w:space="0" w:color="000000"/>
+            </w:tcBorders>
+            <w:tcMar>
+              <w:top w:w="80" w:type="dxa"/>
+              <w:left w:w="120" w:type="dxa"/>
+              <w:bottom w:w="80" w:type="dxa"/>
+              <w:right w:w="120" w:type="dxa"/>
+            </w:tcMar>
+          </w:tcPr>
+          <w:p>
+            <w:r>
+              <w:rPr>
+                <w:sz w:val="20"/>
+                <w:szCs w:val="20"/>
+              </w:rPr>
+              <w:t>Number of input tokens</w:t>
+            </w:r>
+          </w:p>
+        </w:tc>
+      </w:tr>
+      <w:tr>
+        <w:tblPrEx>
+          <w:tblCellMar>
+            <w:top w:w="0" w:type="dxa"/>
+            <w:bottom w:w="0" w:type="dxa"/>
+          </w:tblCellMar>
+        </w:tblPrEx>
+        <w:tc>
+          <w:tcPr>
+            <w:tcW w:w="3200" w:type="dxa"/>
+            <w:tcBorders>
+              <w:top w:val="single" w:sz="1" w:space="0" w:color="000000"/>
+              <w:left w:val="single" w:sz="1" w:space="0" w:color="000000"/>
+              <w:bottom w:val="single" w:sz="1" w:space="0" w:color="000000"/>
+              <w:right w:val="single" w:sz="1" w:space="0" w:color="000000"/>
+            </w:tcBorders>
+            <w:tcMar>
+              <w:top w:w="80" w:type="dxa"/>
+              <w:left w:w="120" w:type="dxa"/>
+              <w:bottom w:w="80" w:type="dxa"/>
+              <w:right w:w="120" w:type="dxa"/>
+            </w:tcMar>
+          </w:tcPr>
+          <w:p>
+            <w:r>
+              <w:rPr>
+                <w:sz w:val="20"/>
+                <w:szCs w:val="20"/>
+              </w:rPr>
+              <w:t>Prompt Eval Duration</w:t>
+            </w:r>
+          </w:p>
+        </w:tc>
+        <w:tc>
+          <w:tcPr>
+            <w:tcW w:w="2000" w:type="dxa"/>
+            <w:tcBorders>
+              <w:top w:val="single" w:sz="1" w:space="0" w:color="000000"/>
+              <w:left w:val="single" w:sz="1" w:space="0" w:color="000000"/>
+              <w:bottom w:val="single" w:sz="1" w:space="0" w:color="000000"/>
+              <w:right w:val="single" w:sz="1" w:space="0" w:color="000000"/>
+            </w:tcBorders>
+            <w:tcMar>
+              <w:top w:w="80" w:type="dxa"/>
+              <w:left w:w="120" w:type="dxa"/>
+              <w:bottom w:w="80" w:type="dxa"/>
+              <w:right w:w="120" w:type="dxa"/>
+            </w:tcMar>
+          </w:tcPr>
+          <w:p>
+            <w:pPr>
+              <w:spacing w:after="200"/>
+            </w:pPr>
+          </w:p>
+        </w:tc>
+        <w:tc>
+          <w:tcPr>
+            <w:tcW w:w="4160" w:type="dxa"/>
+            <w:tcBorders>
+              <w:top w:val="single" w:sz="1" w:space="0" w:color="000000"/>
+              <w:left w:val="single" w:sz="1" w:space="0" w:color="000000"/>
+              <w:bottom w:val="single" w:sz="1" w:space="0" w:color="000000"/>
+              <w:right w:val="single" w:sz="1" w:space="0" w:color="000000"/>
+            </w:tcBorders>
+            <w:tcMar>
+              <w:top w:w="80" w:type="dxa"/>
+              <w:left w:w="120" w:type="dxa"/>
+              <w:bottom w:w="80" w:type="dxa"/>
+              <w:right w:w="120" w:type="dxa"/>
+            </w:tcMar>
+          </w:tcPr>
+          <w:p>
+            <w:r>
+              <w:rPr>
+                <w:sz w:val="20"/>
+                <w:szCs w:val="20"/>
+              </w:rPr>
+              <w:t>Input processing time</w:t>
+            </w:r>
+          </w:p>
+        </w:tc>
+      </w:tr>
+      <w:tr>
+        <w:tblPrEx>
+          <w:tblCellMar>
+            <w:top w:w="0" w:type="dxa"/>
+            <w:bottom w:w="0" w:type="dxa"/>
+          </w:tblCellMar>
+        </w:tblPrEx>
+        <w:tc>
+          <w:tcPr>
+            <w:tcW w:w="3200" w:type="dxa"/>
+            <w:tcBorders>
+              <w:top w:val="single" w:sz="1" w:space="0" w:color="000000"/>
+              <w:left w:val="single" w:sz="1" w:space="0" w:color="000000"/>
+              <w:bottom w:val="single" w:sz="1" w:space="0" w:color="000000"/>
+              <w:right w:val="single" w:sz="1" w:space="0" w:color="000000"/>
+            </w:tcBorders>
+            <w:tcMar>
+              <w:top w:w="80" w:type="dxa"/>
+              <w:left w:w="120" w:type="dxa"/>
+              <w:bottom w:w="80" w:type="dxa"/>
+              <w:right w:w="120" w:type="dxa"/>
+            </w:tcMar>
+          </w:tcPr>
+          <w:p>
+            <w:r>
+              <w:rPr>
+                <w:sz w:val="20"/>
+                <w:szCs w:val="20"/>
+              </w:rPr>
+              <w:t>Prompt Eval Rate</w:t>
+            </w:r>
+          </w:p>
+        </w:tc>
+        <w:tc>
+          <w:tcPr>
+            <w:tcW w:w="2000" w:type="dxa"/>
+            <w:tcBorders>
+              <w:top w:val="single" w:sz="1" w:space="0" w:color="000000"/>
+              <w:left w:val="single" w:sz="1" w:space="0" w:color="000000"/>
+              <w:bottom w:val="single" w:sz="1" w:space="0" w:color="000000"/>
+              <w:right w:val="single" w:sz="1" w:space="0" w:color="000000"/>
+            </w:tcBorders>
+            <w:tcMar>
+              <w:top w:w="80" w:type="dxa"/>
+              <w:left w:w="120" w:type="dxa"/>
+              <w:bottom w:w="80" w:type="dxa"/>
+              <w:right w:w="120" w:type="dxa"/>
+            </w:tcMar>
+          </w:tcPr>
+          <w:p>
+            <w:pPr>
+              <w:spacing w:after="200"/>
+            </w:pPr>
+          </w:p>
+        </w:tc>
+        <w:tc>
+          <w:tcPr>
+            <w:tcW w:w="4160" w:type="dxa"/>
+            <w:tcBorders>
+              <w:top w:val="single" w:sz="1" w:space="0" w:color="000000"/>
+              <w:left w:val="single" w:sz="1" w:space="0" w:color="000000"/>
+              <w:bottom w:val="single" w:sz="1" w:space="0" w:color="000000"/>
+              <w:right w:val="single" w:sz="1" w:space="0" w:color="000000"/>
+            </w:tcBorders>
+            <w:tcMar>
+              <w:top w:w="80" w:type="dxa"/>
+              <w:left w:w="120" w:type="dxa"/>
+              <w:bottom w:w="80" w:type="dxa"/>
+              <w:right w:w="120" w:type="dxa"/>
+            </w:tcMar>
+          </w:tcPr>
+          <w:p>
+            <w:r>
+              <w:rPr>
+                <w:sz w:val="20"/>
+                <w:szCs w:val="20"/>
+              </w:rPr>
+              <w:t>Input processing speed (tokens/s)</w:t>
+            </w:r>
+          </w:p>
+        </w:tc>
+      </w:tr>
+      <w:tr>
+        <w:tblPrEx>
+          <w:tblCellMar>
+            <w:top w:w="0" w:type="dxa"/>
+            <w:bottom w:w="0" w:type="dxa"/>
+          </w:tblCellMar>
+        </w:tblPrEx>
+        <w:tc>
+          <w:tcPr>
+            <w:tcW w:w="3200" w:type="dxa"/>
+            <w:tcBorders>
+              <w:top w:val="single" w:sz="1" w:space="0" w:color="000000"/>
+              <w:left w:val="single" w:sz="1" w:space="0" w:color="000000"/>
+              <w:bottom w:val="single" w:sz="1" w:space="0" w:color="000000"/>
+              <w:right w:val="single" w:sz="1" w:space="0" w:color="000000"/>
+            </w:tcBorders>
+            <w:tcMar>
+              <w:top w:w="80" w:type="dxa"/>
+              <w:left w:w="120" w:type="dxa"/>
+              <w:bottom w:w="80" w:type="dxa"/>
+              <w:right w:w="120" w:type="dxa"/>
+            </w:tcMar>
+          </w:tcPr>
+          <w:p>
+            <w:r>
+              <w:rPr>
+                <w:sz w:val="20"/>
+                <w:szCs w:val="20"/>
+              </w:rPr>
+              <w:t>Eval Count</w:t>
+            </w:r>
+          </w:p>
+        </w:tc>
+        <w:tc>
+          <w:tcPr>
+            <w:tcW w:w="2000" w:type="dxa"/>
+            <w:tcBorders>
+              <w:top w:val="single" w:sz="1" w:space="0" w:color="000000"/>
+              <w:left w:val="single" w:sz="1" w:space="0" w:color="000000"/>
+              <w:bottom w:val="single" w:sz="1" w:space="0" w:color="000000"/>
+              <w:right w:val="single" w:sz="1" w:space="0" w:color="000000"/>
+            </w:tcBorders>
+            <w:tcMar>
+              <w:top w:w="80" w:type="dxa"/>
+              <w:left w:w="120" w:type="dxa"/>
+              <w:bottom w:w="80" w:type="dxa"/>
+              <w:right w:w="120" w:type="dxa"/>
+            </w:tcMar>
+          </w:tcPr>
+          <w:p>
+            <w:pPr>
+              <w:spacing w:after="200"/>
+            </w:pPr>
+          </w:p>
+        </w:tc>
+        <w:tc>
+          <w:tcPr>
+            <w:tcW w:w="4160" w:type="dxa"/>
+            <w:tcBorders>
+              <w:top w:val="single" w:sz="1" w:space="0" w:color="000000"/>
+              <w:left w:val="single" w:sz="1" w:space="0" w:color="000000"/>
+              <w:bottom w:val="single" w:sz="1" w:space="0" w:color="000000"/>
+              <w:right w:val="single" w:sz="1" w:space="0" w:color="000000"/>
+            </w:tcBorders>
+            <w:tcMar>
+              <w:top w:w="80" w:type="dxa"/>
+              <w:left w:w="120" w:type="dxa"/>
+              <w:bottom w:w="80" w:type="dxa"/>
+              <w:right w:w="120" w:type="dxa"/>
+            </w:tcMar>
+          </w:tcPr>
+          <w:p>
+            <w:r>
+              <w:rPr>
+                <w:sz w:val="20"/>
+                <w:szCs w:val="20"/>
+              </w:rPr>
+              <w:t>Number of output tokens</w:t>
+            </w:r>
+          </w:p>
+        </w:tc>
+      </w:tr>
+      <w:tr>
+        <w:tblPrEx>
+          <w:tblCellMar>
+            <w:top w:w="0" w:type="dxa"/>
+            <w:bottom w:w="0" w:type="dxa"/>
+          </w:tblCellMar>
+        </w:tblPrEx>
+        <w:tc>
+          <w:tcPr>
+            <w:tcW w:w="3200" w:type="dxa"/>
+            <w:tcBorders>
+              <w:top w:val="single" w:sz="1" w:space="0" w:color="000000"/>
+              <w:left w:val="single" w:sz="1" w:space="0" w:color="000000"/>
+              <w:bottom w:val="single" w:sz="1" w:space="0" w:color="000000"/>
+              <w:right w:val="single" w:sz="1" w:space="0" w:color="000000"/>
+            </w:tcBorders>
+            <w:tcMar>
+              <w:top w:w="80" w:type="dxa"/>
+              <w:left w:w="120" w:type="dxa"/>
+              <w:bottom w:w="80" w:type="dxa"/>
+              <w:right w:w="120" w:type="dxa"/>
+            </w:tcMar>
+          </w:tcPr>
+          <w:p>
+            <w:r>
+              <w:rPr>
+                <w:sz w:val="20"/>
+                <w:szCs w:val="20"/>
+              </w:rPr>
+              <w:t>Eval Duration</w:t>
+            </w:r>
+          </w:p>
+        </w:tc>
+        <w:tc>
+          <w:tcPr>
+            <w:tcW w:w="2000" w:type="dxa"/>
+            <w:tcBorders>
+              <w:top w:val="single" w:sz="1" w:space="0" w:color="000000"/>
+              <w:left w:val="single" w:sz="1" w:space="0" w:color="000000"/>
+              <w:bottom w:val="single" w:sz="1" w:space="0" w:color="000000"/>
+              <w:right w:val="single" w:sz="1" w:space="0" w:color="000000"/>
+            </w:tcBorders>
+            <w:tcMar>
+              <w:top w:w="80" w:type="dxa"/>
+              <w:left w:w="120" w:type="dxa"/>
+              <w:bottom w:w="80" w:type="dxa"/>
+              <w:right w:w="120" w:type="dxa"/>
+            </w:tcMar>
+          </w:tcPr>
+          <w:p>
+            <w:pPr>
+              <w:spacing w:after="200"/>
+            </w:pPr>
+          </w:p>
+        </w:tc>
+        <w:tc>
+          <w:tcPr>
+            <w:tcW w:w="4160" w:type="dxa"/>
+            <w:tcBorders>
+              <w:top w:val="single" w:sz="1" w:space="0" w:color="000000"/>
+              <w:left w:val="single" w:sz="1" w:space="0" w:color="000000"/>
+              <w:bottom w:val="single" w:sz="1" w:space="0" w:color="000000"/>
+              <w:right w:val="single" w:sz="1" w:space="0" w:color="000000"/>
+            </w:tcBorders>
+            <w:tcMar>
+              <w:top w:w="80" w:type="dxa"/>
+              <w:left w:w="120" w:type="dxa"/>
+              <w:bottom w:w="80" w:type="dxa"/>
+              <w:right w:w="120" w:type="dxa"/>
+            </w:tcMar>
+          </w:tcPr>
+          <w:p>
+            <w:r>
+              <w:rPr>
+                <w:sz w:val="20"/>
+                <w:szCs w:val="20"/>
+              </w:rPr>
+              <w:t>Output generation time</w:t>
+            </w:r>
+          </w:p>
+        </w:tc>
+      </w:tr>
+      <w:tr>
+        <w:tblPrEx>
+          <w:tblCellMar>
+            <w:top w:w="0" w:type="dxa"/>
+            <w:bottom w:w="0" w:type="dxa"/>
+          </w:tblCellMar>
+        </w:tblPrEx>
+        <w:tc>
+          <w:tcPr>
+            <w:tcW w:w="3200" w:type="dxa"/>
+            <w:tcBorders>
+              <w:top w:val="single" w:sz="1" w:space="0" w:color="000000"/>
+              <w:left w:val="single" w:sz="1" w:space="0" w:color="000000"/>
+              <w:bottom w:val="single" w:sz="1" w:space="0" w:color="000000"/>
+              <w:right w:val="single" w:sz="1" w:space="0" w:color="000000"/>
+            </w:tcBorders>
+            <w:tcMar>
+              <w:top w:w="80" w:type="dxa"/>
+              <w:left w:w="120" w:type="dxa"/>
+              <w:bottom w:w="80" w:type="dxa"/>
+              <w:right w:w="120" w:type="dxa"/>
+            </w:tcMar>
+          </w:tcPr>
+          <w:p>
+            <w:r>
+              <w:rPr>
+                <w:sz w:val="20"/>
+                <w:szCs w:val="20"/>
+              </w:rPr>
+              <w:lastRenderedPageBreak/>
+              <w:t>Eval Rate</w:t>
+            </w:r>
+          </w:p>
+        </w:tc>
+        <w:tc>
+          <w:tcPr>
+            <w:tcW w:w="2000" w:type="dxa"/>
+            <w:tcBorders>
+              <w:top w:val="single" w:sz="1" w:space="0" w:color="000000"/>
+              <w:left w:val="single" w:sz="1" w:space="0" w:color="000000"/>
+              <w:bottom w:val="single" w:sz="1" w:space="0" w:color="000000"/>
+              <w:right w:val="single" w:sz="1" w:space="0" w:color="000000"/>
+            </w:tcBorders>
+            <w:tcMar>
+              <w:top w:w="80" w:type="dxa"/>
+              <w:left w:w="120" w:type="dxa"/>
+              <w:bottom w:w="80" w:type="dxa"/>
+              <w:right w:w="120" w:type="dxa"/>
+            </w:tcMar>
+          </w:tcPr>
+          <w:p>
+            <w:pPr>
+              <w:spacing w:after="200"/>
+            </w:pPr>
+          </w:p>
+        </w:tc>
+        <w:tc>
+          <w:tcPr>
+            <w:tcW w:w="4160" w:type="dxa"/>
+            <w:tcBorders>
+              <w:top w:val="single" w:sz="1" w:space="0" w:color="000000"/>
+              <w:left w:val="single" w:sz="1" w:space="0" w:color="000000"/>
+              <w:bottom w:val="single" w:sz="1" w:space="0" w:color="000000"/>
+              <w:right w:val="single" w:sz="1" w:space="0" w:color="000000"/>
+            </w:tcBorders>
+            <w:tcMar>
+              <w:top w:w="80" w:type="dxa"/>
+              <w:left w:w="120" w:type="dxa"/>
+              <w:bottom w:w="80" w:type="dxa"/>
+              <w:right w:w="120" w:type="dxa"/>
+            </w:tcMar>
+          </w:tcPr>
+          <w:p>
+            <w:r>
+              <w:rPr>
+                <w:sz w:val="20"/>
+                <w:szCs w:val="20"/>
+              </w:rPr>
+              <w:t>Output generation speed (tokens/s)</w:t>
+            </w:r>
+          </w:p>
+        </w:tc>
+      </w:tr>
+    </w:tbl>
+    <w:p>
+      <w:pPr>
+        <w:spacing w:before="100" w:after="100"/>
+      </w:pPr>
+    </w:p>
+    <w:p>
+      <w:pPr>
+        <w:pStyle w:val="Heading2"/>
+        <w:spacing w:before="300" w:after="100"/>
+      </w:pPr>
+      <w:r>
+        <w:t>A100 — Model 3: deepseek-r1:7b</w:t>
       </w:r>
     </w:p>
     <w:tbl>
@@ -7164,10 +10318,10 @@
 <file path=word/numbering.xml><?xml version="1.0" encoding="utf-8"?>
 <w:numbering xmlns:wpc="http://schemas.microsoft.com/office/word/2010/wordprocessingCanvas" xmlns:cx="http://schemas.microsoft.com/office/drawing/2014/chartex" xmlns:cx1="http://schemas.microsoft.com/office/drawing/2015/9/8/chartex" xmlns:cx2="http://schemas.microsoft.com/office/drawing/2015/10/21/chartex" xmlns:cx3="http://schemas.microsoft.com/office/drawing/2016/5/9/chartex" xmlns:cx4="http://schemas.microsoft.com/office/drawing/2016/5/10/chartex" xmlns:cx5="http://schemas.microsoft.com/office/drawing/2016/5/11/chartex" xmlns:cx6="http://schemas.microsoft.com/office/drawing/2016/5/12/chartex" xmlns:cx7="http://schemas.microsoft.com/office/drawing/2016/5/13/chartex" xmlns:cx8="http://schemas.microsoft.com/office/drawing/2016/5/14/chartex" xmlns:mc="http://schemas.openxmlformats.org/markup-compatibility/2006" xmlns:aink="http://schemas.microsoft.com/office/drawing/2016/ink" xmlns:am3d="http://schemas.microsoft.com/office/drawing/2017/model3d" xmlns:o="urn:schemas-microsoft-com:office:office" xmlns:oel="http://schemas.microsoft.com/office/2019/extlst" xmlns:r="http://schemas.openxmlformats.org/officeDocument/2006/relationships" xmlns:m="http://schemas.openxmlformats.org/officeDocument/2006/math" xmlns:v="urn:schemas-microsoft-com:vml" xmlns:wp14="http://schemas.microsoft.com/office/word/2010/wordprocessingDrawing" xmlns:wp="http://schemas.openxmlformats.org/drawingml/2006/wordprocessingDrawing" xmlns:w10="urn:schemas-microsoft-com:office:word" xmlns:w="http://schemas.openxmlformats.org/wordprocessingml/2006/main" xmlns:w14="http://schemas.microsoft.com/office/word/2010/wordml" xmlns:w15="http://schemas.microsoft.com/office/word/2012/wordml" xmlns:w16cex="http://schemas.microsoft.com/office/word/2018/wordml/cex" xmlns:w16cid="http://schemas.microsoft.com/office/word/2016/wordml/cid" xmlns:w16="http://schemas.microsoft.com/office/word/2018/wordml" xmlns:w16du="http://schemas.microsoft.com/office/word/2023/wordml/word16du" xmlns:w16sdtdh="http://schemas.microsoft.com/office/word/2020/wordml/sdtdatahash" xmlns:w16sdtfl="http://schemas.microsoft.com/office/word/2024/wordml/sdtformatlock" xmlns:w16se="http://schemas.microsoft.com/office/word/2015/wordml/symex" xmlns:wpg="http://schemas.microsoft.com/office/word/2010/wordprocessingGroup" xmlns:wpi="http://schemas.microsoft.com/office/word/2010/wordprocessingInk" xmlns:wne="http://schemas.microsoft.com/office/word/2006/wordml" xmlns:wps="http://schemas.microsoft.com/office/word/2010/wordprocessingShape" mc:Ignorable="w14 w15 w16se w16cid w16 w16cex w16sdtdh w16sdtfl w16du wp14">
   <w:abstractNum w:abstractNumId="0" w15:restartNumberingAfterBreak="0">
-    <w:nsid w:val="06504C97"/>
+    <w:nsid w:val="13B30151"/>
     <w:multiLevelType w:val="hybridMultilevel"/>
-    <w:tmpl w:val="2110DB44"/>
-    <w:lvl w:ilvl="0" w:tplc="532C38EC">
+    <w:tmpl w:val="4340460C"/>
+    <w:lvl w:ilvl="0" w:tplc="AB02E4CA">
       <w:start w:val="1"/>
       <w:numFmt w:val="bullet"/>
       <w:lvlText w:val="●"/>
@@ -7176,7 +10330,7 @@
         <w:ind w:left="720" w:hanging="360"/>
       </w:pPr>
     </w:lvl>
-    <w:lvl w:ilvl="1" w:tplc="193C844A">
+    <w:lvl w:ilvl="1" w:tplc="AA647110">
       <w:start w:val="1"/>
       <w:numFmt w:val="bullet"/>
       <w:lvlText w:val="○"/>
@@ -7185,7 +10339,7 @@
         <w:ind w:left="1440" w:hanging="360"/>
       </w:pPr>
     </w:lvl>
-    <w:lvl w:ilvl="2" w:tplc="98AA5144">
+    <w:lvl w:ilvl="2" w:tplc="CF78D354">
       <w:start w:val="1"/>
       <w:numFmt w:val="bullet"/>
       <w:lvlText w:val="■"/>
@@ -7194,7 +10348,7 @@
         <w:ind w:left="2160" w:hanging="360"/>
       </w:pPr>
     </w:lvl>
-    <w:lvl w:ilvl="3" w:tplc="0EF8A84A">
+    <w:lvl w:ilvl="3" w:tplc="E3C81A5C">
       <w:start w:val="1"/>
       <w:numFmt w:val="bullet"/>
       <w:lvlText w:val="●"/>
@@ -7203,7 +10357,7 @@
         <w:ind w:left="2880" w:hanging="360"/>
       </w:pPr>
     </w:lvl>
-    <w:lvl w:ilvl="4" w:tplc="D370ED9A">
+    <w:lvl w:ilvl="4" w:tplc="AB10FB3E">
       <w:start w:val="1"/>
       <w:numFmt w:val="bullet"/>
       <w:lvlText w:val="○"/>
@@ -7212,7 +10366,7 @@
         <w:ind w:left="3600" w:hanging="360"/>
       </w:pPr>
     </w:lvl>
-    <w:lvl w:ilvl="5" w:tplc="F5BCAD5A">
+    <w:lvl w:ilvl="5" w:tplc="32D22096">
       <w:start w:val="1"/>
       <w:numFmt w:val="bullet"/>
       <w:lvlText w:val="■"/>
@@ -7221,7 +10375,7 @@
         <w:ind w:left="4320" w:hanging="360"/>
       </w:pPr>
     </w:lvl>
-    <w:lvl w:ilvl="6" w:tplc="EE749DDC">
+    <w:lvl w:ilvl="6" w:tplc="7E982F20">
       <w:start w:val="1"/>
       <w:numFmt w:val="bullet"/>
       <w:lvlText w:val="●"/>
@@ -7230,7 +10384,7 @@
         <w:ind w:left="5040" w:hanging="360"/>
       </w:pPr>
     </w:lvl>
-    <w:lvl w:ilvl="7" w:tplc="7192801C">
+    <w:lvl w:ilvl="7" w:tplc="59F2F8EC">
       <w:start w:val="1"/>
       <w:numFmt w:val="bullet"/>
       <w:lvlText w:val="●"/>
@@ -7239,7 +10393,7 @@
         <w:ind w:left="5760" w:hanging="360"/>
       </w:pPr>
     </w:lvl>
-    <w:lvl w:ilvl="8" w:tplc="300202BA">
+    <w:lvl w:ilvl="8" w:tplc="1D1C43CE">
       <w:start w:val="1"/>
       <w:numFmt w:val="bullet"/>
       <w:lvlText w:val="●"/>
@@ -7249,7 +10403,7 @@
       </w:pPr>
     </w:lvl>
   </w:abstractNum>
-  <w:num w:numId="1" w16cid:durableId="2069693515">
+  <w:num w:numId="1" w16cid:durableId="710806780">
     <w:abstractNumId w:val="0"/>
     <w:lvlOverride w:ilvl="0">
       <w:startOverride w:val="1"/>

</xml_diff>